<commit_message>
Add 'evt_fix_output' to 'evt'.
</commit_message>
<xml_diff>
--- a/doc/Change log.docx
+++ b/doc/Change log.docx
@@ -58,19 +58,19 @@
         <w:rPr>
           <w:lang w:val="en-AU"/>
         </w:rPr>
-        <w:t>20</w:t>
-      </w:r>
-      <w:r>
-        <w:rPr>
-          <w:lang w:val="en-AU"/>
-        </w:rPr>
-        <w:t>-25</w:t>
-      </w:r>
-      <w:r>
-        <w:rPr>
-          <w:lang w:val="en-AU"/>
-        </w:rPr>
-        <w:t xml:space="preserve"> May, 2026</w:t>
+        <w:t>2</w:t>
+      </w:r>
+      <w:r>
+        <w:rPr>
+          <w:lang w:val="en-AU"/>
+        </w:rPr>
+        <w:t>7</w:t>
+      </w:r>
+      <w:r>
+        <w:rPr>
+          <w:lang w:val="en-AU"/>
+        </w:rPr>
+        <w:t xml:space="preserve"> May, 2026 (branch “main”)</w:t>
       </w:r>
     </w:p>
     <w:p>
@@ -92,6 +92,198 @@
         </w:numPr>
       </w:pPr>
       <w:r>
+        <w:t>E</w:t>
+      </w:r>
+      <w:r>
+        <w:t>vt</w:t>
+      </w:r>
+    </w:p>
+    <w:p>
+      <w:pPr>
+        <w:numPr>
+          <w:ilvl w:val="2"/>
+          <w:numId w:val="78"/>
+        </w:numPr>
+      </w:pPr>
+      <w:r>
+        <w:t xml:space="preserve">Use new ‘evt_fix_output’ in template read (2D and 3D), </w:t>
+      </w:r>
+      <w:r>
+        <w:t>'charge-scan'</w:t>
+      </w:r>
+      <w:r>
+        <w:t xml:space="preserve"> </w:t>
+      </w:r>
+      <w:r>
+        <w:t>event, ‘finish’ after event code, ‘evt_set_evt_file’ and ‘evt_set_output_file’.</w:t>
+      </w:r>
+    </w:p>
+    <w:p>
+      <w:pPr>
+        <w:numPr>
+          <w:ilvl w:val="1"/>
+          <w:numId w:val="78"/>
+        </w:numPr>
+      </w:pPr>
+      <w:r>
+        <w:t>evt_fix_output</w:t>
+      </w:r>
+    </w:p>
+    <w:p>
+      <w:pPr>
+        <w:numPr>
+          <w:ilvl w:val="2"/>
+          <w:numId w:val="78"/>
+        </w:numPr>
+      </w:pPr>
+      <w:r>
+        <w:t>Fix output filename to add ending for mode “cuts”, “MPDA”.</w:t>
+      </w:r>
+    </w:p>
+    <w:p>
+      <w:pPr>
+        <w:numPr>
+          <w:ilvl w:val="1"/>
+          <w:numId w:val="78"/>
+        </w:numPr>
+      </w:pPr>
+      <w:r>
+        <w:t>Image_details</w:t>
+      </w:r>
+    </w:p>
+    <w:p>
+      <w:pPr>
+        <w:numPr>
+          <w:ilvl w:val="2"/>
+          <w:numId w:val="78"/>
+        </w:numPr>
+      </w:pPr>
+      <w:r>
+        <w:t>Added “All counts” mode, which was missing.</w:t>
+      </w:r>
+    </w:p>
+    <w:p>
+      <w:pPr>
+        <w:numPr>
+          <w:ilvl w:val="1"/>
+          <w:numId w:val="78"/>
+        </w:numPr>
+      </w:pPr>
+      <w:r>
+        <w:t>Version 9.0a</w:t>
+      </w:r>
+    </w:p>
+    <w:p>
+      <w:pPr>
+        <w:pStyle w:val="Heading3"/>
+        <w:rPr>
+          <w:lang w:val="en-AU"/>
+        </w:rPr>
+      </w:pPr>
+      <w:r>
+        <w:rPr>
+          <w:lang w:val="en-AU"/>
+        </w:rPr>
+        <w:t>2</w:t>
+      </w:r>
+      <w:r>
+        <w:rPr>
+          <w:lang w:val="en-AU"/>
+        </w:rPr>
+        <w:t>6</w:t>
+      </w:r>
+      <w:r>
+        <w:rPr>
+          <w:lang w:val="en-AU"/>
+        </w:rPr>
+        <w:t xml:space="preserve"> May, 2026 (branch “m</w:t>
+      </w:r>
+      <w:r>
+        <w:rPr>
+          <w:lang w:val="en-AU"/>
+        </w:rPr>
+        <w:t>bda</w:t>
+      </w:r>
+      <w:r>
+        <w:rPr>
+          <w:lang w:val="en-AU"/>
+        </w:rPr>
+        <w:t>”)</w:t>
+      </w:r>
+    </w:p>
+    <w:p>
+      <w:pPr>
+        <w:numPr>
+          <w:ilvl w:val="0"/>
+          <w:numId w:val="85"/>
+        </w:numPr>
+      </w:pPr>
+      <w:r>
+        <w:t>Experimental side-branch “mbda” to trial a “MultiBack DA” (MBDA) method as a way to target background shape primarily. See branch “mbda” and this file there.</w:t>
+      </w:r>
+    </w:p>
+    <w:p>
+      <w:pPr>
+        <w:numPr>
+          <w:ilvl w:val="0"/>
+          <w:numId w:val="85"/>
+        </w:numPr>
+      </w:pPr>
+      <w:r>
+        <w:t>Conclusion: May be better to stick with MPDA and use it differently to track large variation in background shapes using suitable empirical endmembers set on extreme hot spots.</w:t>
+      </w:r>
+    </w:p>
+    <w:p>
+      <w:pPr>
+        <w:pStyle w:val="Heading3"/>
+        <w:rPr>
+          <w:lang w:val="en-AU"/>
+        </w:rPr>
+      </w:pPr>
+      <w:r>
+        <w:rPr>
+          <w:lang w:val="en-AU"/>
+        </w:rPr>
+        <w:t>20</w:t>
+      </w:r>
+      <w:r>
+        <w:rPr>
+          <w:lang w:val="en-AU"/>
+        </w:rPr>
+        <w:t>-25</w:t>
+      </w:r>
+      <w:r>
+        <w:rPr>
+          <w:lang w:val="en-AU"/>
+        </w:rPr>
+        <w:t xml:space="preserve"> May, 2026</w:t>
+      </w:r>
+      <w:r>
+        <w:rPr>
+          <w:lang w:val="en-AU"/>
+        </w:rPr>
+        <w:t xml:space="preserve"> (branch “main”)</w:t>
+      </w:r>
+    </w:p>
+    <w:p>
+      <w:pPr>
+        <w:numPr>
+          <w:ilvl w:val="0"/>
+          <w:numId w:val="86"/>
+        </w:numPr>
+      </w:pPr>
+      <w:r>
+        <w:t>Main GeoPIXE</w:t>
+      </w:r>
+    </w:p>
+    <w:p>
+      <w:pPr>
+        <w:numPr>
+          <w:ilvl w:val="1"/>
+          <w:numId w:val="86"/>
+        </w:numPr>
+      </w:pPr>
+      <w:r>
         <w:t>Da_evt</w:t>
       </w:r>
     </w:p>
@@ -99,7 +291,7 @@
       <w:pPr>
         <w:numPr>
           <w:ilvl w:val="2"/>
-          <w:numId w:val="78"/>
+          <w:numId w:val="86"/>
         </w:numPr>
       </w:pPr>
       <w:r>
@@ -110,7 +302,7 @@
       <w:pPr>
         <w:numPr>
           <w:ilvl w:val="2"/>
-          <w:numId w:val="78"/>
+          <w:numId w:val="86"/>
         </w:numPr>
       </w:pPr>
       <w:r>
@@ -121,7 +313,7 @@
       <w:pPr>
         <w:numPr>
           <w:ilvl w:val="1"/>
-          <w:numId w:val="78"/>
+          <w:numId w:val="86"/>
         </w:numPr>
       </w:pPr>
       <w:r>
@@ -147,7 +339,7 @@
       <w:pPr>
         <w:numPr>
           <w:ilvl w:val="2"/>
-          <w:numId w:val="78"/>
+          <w:numId w:val="86"/>
         </w:numPr>
       </w:pPr>
       <w:r>
@@ -158,7 +350,7 @@
       <w:pPr>
         <w:numPr>
           <w:ilvl w:val="1"/>
-          <w:numId w:val="78"/>
+          <w:numId w:val="86"/>
         </w:numPr>
       </w:pPr>
       <w:r>
@@ -169,7 +361,7 @@
       <w:pPr>
         <w:numPr>
           <w:ilvl w:val="2"/>
-          <w:numId w:val="78"/>
+          <w:numId w:val="86"/>
         </w:numPr>
       </w:pPr>
       <w:r>
@@ -180,7 +372,7 @@
       <w:pPr>
         <w:numPr>
           <w:ilvl w:val="1"/>
-          <w:numId w:val="78"/>
+          <w:numId w:val="86"/>
         </w:numPr>
       </w:pPr>
       <w:r>
@@ -191,7 +383,7 @@
       <w:pPr>
         <w:numPr>
           <w:ilvl w:val="2"/>
-          <w:numId w:val="78"/>
+          <w:numId w:val="86"/>
         </w:numPr>
       </w:pPr>
       <w:r>
@@ -202,7 +394,7 @@
       <w:pPr>
         <w:numPr>
           <w:ilvl w:val="1"/>
-          <w:numId w:val="78"/>
+          <w:numId w:val="86"/>
         </w:numPr>
       </w:pPr>
       <w:r>
@@ -213,7 +405,7 @@
       <w:pPr>
         <w:numPr>
           <w:ilvl w:val="2"/>
-          <w:numId w:val="78"/>
+          <w:numId w:val="86"/>
         </w:numPr>
       </w:pPr>
       <w:r>
@@ -224,7 +416,7 @@
       <w:pPr>
         <w:numPr>
           <w:ilvl w:val="2"/>
-          <w:numId w:val="78"/>
+          <w:numId w:val="86"/>
         </w:numPr>
       </w:pPr>
       <w:r>
@@ -238,7 +430,7 @@
       <w:pPr>
         <w:numPr>
           <w:ilvl w:val="1"/>
-          <w:numId w:val="78"/>
+          <w:numId w:val="86"/>
         </w:numPr>
       </w:pPr>
       <w:r>
@@ -249,7 +441,7 @@
       <w:pPr>
         <w:numPr>
           <w:ilvl w:val="2"/>
-          <w:numId w:val="78"/>
+          <w:numId w:val="86"/>
         </w:numPr>
       </w:pPr>
       <w:r>
@@ -266,7 +458,7 @@
       <w:pPr>
         <w:numPr>
           <w:ilvl w:val="1"/>
-          <w:numId w:val="78"/>
+          <w:numId w:val="86"/>
         </w:numPr>
       </w:pPr>
       <w:r>
@@ -277,7 +469,7 @@
       <w:pPr>
         <w:numPr>
           <w:ilvl w:val="0"/>
-          <w:numId w:val="78"/>
+          <w:numId w:val="86"/>
         </w:numPr>
       </w:pPr>
       <w:r>
@@ -288,7 +480,7 @@
       <w:pPr>
         <w:numPr>
           <w:ilvl w:val="1"/>
-          <w:numId w:val="78"/>
+          <w:numId w:val="86"/>
         </w:numPr>
       </w:pPr>
       <w:r>
@@ -299,21 +491,18 @@
       <w:pPr>
         <w:numPr>
           <w:ilvl w:val="0"/>
-          <w:numId w:val="78"/>
-        </w:numPr>
-      </w:pPr>
-      <w:r>
-        <w:t>FalconX</w:t>
-      </w:r>
-      <w:r>
-        <w:t xml:space="preserve"> device</w:t>
-      </w:r>
-    </w:p>
-    <w:p>
-      <w:pPr>
-        <w:numPr>
-          <w:ilvl w:val="1"/>
-          <w:numId w:val="78"/>
+          <w:numId w:val="86"/>
+        </w:numPr>
+      </w:pPr>
+      <w:r>
+        <w:t>FalconX device</w:t>
+      </w:r>
+    </w:p>
+    <w:p>
+      <w:pPr>
+        <w:numPr>
+          <w:ilvl w:val="1"/>
+          <w:numId w:val="86"/>
         </w:numPr>
       </w:pPr>
       <w:r>
@@ -324,7 +513,7 @@
       <w:pPr>
         <w:numPr>
           <w:ilvl w:val="0"/>
-          <w:numId w:val="78"/>
+          <w:numId w:val="86"/>
         </w:numPr>
         <w:rPr>
           <w:b/>
@@ -352,7 +541,7 @@
       <w:pPr>
         <w:numPr>
           <w:ilvl w:val="1"/>
-          <w:numId w:val="78"/>
+          <w:numId w:val="86"/>
         </w:numPr>
       </w:pPr>
       <w:r>
@@ -372,10 +561,11 @@
       <w:pPr>
         <w:numPr>
           <w:ilvl w:val="1"/>
-          <w:numId w:val="78"/>
-        </w:numPr>
-      </w:pPr>
-      <w:r>
+          <w:numId w:val="86"/>
+        </w:numPr>
+      </w:pPr>
+      <w:r>
+        <w:lastRenderedPageBreak/>
         <w:t>If this happens, enable log mode. A helpful trick is to add a prefix to any lines printed by ‘gprint’</w:t>
       </w:r>
       <w:r>
@@ -404,7 +594,7 @@
       <w:pPr>
         <w:numPr>
           <w:ilvl w:val="1"/>
-          <w:numId w:val="78"/>
+          <w:numId w:val="86"/>
         </w:numPr>
       </w:pPr>
       <w:r>
@@ -424,7 +614,7 @@
       <w:pPr>
         <w:numPr>
           <w:ilvl w:val="1"/>
-          <w:numId w:val="78"/>
+          <w:numId w:val="86"/>
         </w:numPr>
       </w:pPr>
       <w:r>
@@ -444,7 +634,7 @@
       <w:pPr>
         <w:numPr>
           <w:ilvl w:val="1"/>
-          <w:numId w:val="78"/>
+          <w:numId w:val="86"/>
         </w:numPr>
       </w:pPr>
       <w:r>
@@ -455,7 +645,7 @@
       <w:pPr>
         <w:numPr>
           <w:ilvl w:val="1"/>
-          <w:numId w:val="78"/>
+          <w:numId w:val="86"/>
         </w:numPr>
         <w:rPr>
           <w:highlight w:val="yellow"/>
@@ -472,7 +662,7 @@
       <w:pPr>
         <w:numPr>
           <w:ilvl w:val="2"/>
-          <w:numId w:val="78"/>
+          <w:numId w:val="86"/>
         </w:numPr>
       </w:pPr>
       <w:r>
@@ -489,7 +679,7 @@
       <w:pPr>
         <w:numPr>
           <w:ilvl w:val="2"/>
-          <w:numId w:val="78"/>
+          <w:numId w:val="86"/>
         </w:numPr>
       </w:pPr>
       <w:r>
@@ -618,7 +808,6 @@
         </w:numPr>
       </w:pPr>
       <w:r>
-        <w:lastRenderedPageBreak/>
         <w:t>Evt_start</w:t>
       </w:r>
     </w:p>
@@ -1025,6 +1214,7 @@
         </w:numPr>
       </w:pPr>
       <w:r>
+        <w:lastRenderedPageBreak/>
         <w:t>Fit_setup</w:t>
       </w:r>
     </w:p>
@@ -1228,7 +1418,6 @@
         </w:numPr>
       </w:pPr>
       <w:r>
-        <w:lastRenderedPageBreak/>
         <w:t>Define</w:t>
       </w:r>
     </w:p>
@@ -1663,6 +1852,7 @@
         </w:numPr>
       </w:pPr>
       <w:r>
+        <w:lastRenderedPageBreak/>
         <w:t>Changed tab name to “XFM(AS)” to distinguish it from other XFM plugins.</w:t>
       </w:r>
     </w:p>
@@ -1871,7 +2061,6 @@
         </w:numPr>
       </w:pPr>
       <w:r>
-        <w:lastRenderedPageBreak/>
         <w:t>Geopixe_execute</w:t>
       </w:r>
     </w:p>
@@ -2281,6 +2470,7 @@
         </w:numPr>
       </w:pPr>
       <w:r>
+        <w:lastRenderedPageBreak/>
         <w:t>Potentially, may still cancel a non-XY scan mode in a special template.</w:t>
       </w:r>
     </w:p>
@@ -2483,7 +2673,6 @@
         </w:numPr>
       </w:pPr>
       <w:r>
-        <w:lastRenderedPageBreak/>
         <w:t>Occasional X=0 when near X maximum turn-around</w:t>
       </w:r>
     </w:p>
@@ -3167,6 +3356,7 @@
         </w:numPr>
       </w:pPr>
       <w:r>
+        <w:lastRenderedPageBreak/>
         <w:t>Add code for a “Correct Y” option, to correct for wandering Y axis after turn-around.</w:t>
       </w:r>
     </w:p>
@@ -3388,7 +3578,6 @@
         </w:numPr>
       </w:pPr>
       <w:r>
-        <w:lastRenderedPageBreak/>
         <w:t>Add code to veto tiny periodic table, only for Linux, due to display bug.</w:t>
       </w:r>
     </w:p>
@@ -3740,6 +3929,7 @@
         </w:numPr>
       </w:pPr>
       <w:r>
+        <w:lastRenderedPageBreak/>
         <w:t>Image_eventcb</w:t>
       </w:r>
     </w:p>
@@ -3984,7 +4174,6 @@
         </w:numPr>
       </w:pPr>
       <w:r>
-        <w:lastRenderedPageBreak/>
         <w:t xml:space="preserve">Has a new keyword /refine, to </w:t>
       </w:r>
       <w:r>
@@ -4232,6 +4421,7 @@
         <w:rPr>
           <w:lang w:val="en-AU"/>
         </w:rPr>
+        <w:lastRenderedPageBreak/>
         <w:t>26</w:t>
       </w:r>
       <w:r>
@@ -4440,7 +4630,6 @@
         <w:rPr>
           <w:lang w:val="en-AU"/>
         </w:rPr>
-        <w:lastRenderedPageBreak/>
         <w:t>24</w:t>
       </w:r>
       <w:r>
@@ -4876,6 +5065,7 @@
         </w:numPr>
       </w:pPr>
       <w:r>
+        <w:lastRenderedPageBreak/>
         <w:t>Use ‘size=1.2’ to “Plot_maia_parameters” to make detector labels larger.</w:t>
       </w:r>
     </w:p>
@@ -5072,7 +5262,6 @@
         </w:numPr>
       </w:pPr>
       <w:r>
-        <w:lastRenderedPageBreak/>
         <w:t xml:space="preserve">Middle mouse button </w:t>
       </w:r>
       <w:r>
@@ -5455,6 +5644,7 @@
         </w:numPr>
       </w:pPr>
       <w:r>
+        <w:lastRenderedPageBreak/>
         <w:t>Detector_setup</w:t>
       </w:r>
     </w:p>
@@ -5672,7 +5862,6 @@
         </w:numPr>
       </w:pPr>
       <w:r>
-        <w:lastRenderedPageBreak/>
         <w:t>Corr</w:t>
       </w:r>
     </w:p>
@@ -6132,6 +6321,7 @@
         </w:numPr>
       </w:pPr>
       <w:r>
+        <w:lastRenderedPageBreak/>
         <w:t>In its Timer event code, call  “</w:t>
       </w:r>
       <w:r>
@@ -6376,7 +6566,6 @@
         <w:rPr>
           <w:lang w:val="en-AU"/>
         </w:rPr>
-        <w:lastRenderedPageBreak/>
         <w:t>21</w:t>
       </w:r>
       <w:r>
@@ -6781,6 +6970,7 @@
         </w:numPr>
       </w:pPr>
       <w:r>
+        <w:lastRenderedPageBreak/>
         <w:t xml:space="preserve">Wizard actions: </w:t>
       </w:r>
       <w:r>
@@ -6998,7 +7188,6 @@
         </w:numPr>
       </w:pPr>
       <w:r>
-        <w:lastRenderedPageBreak/>
         <w:t>Send a new action (‘sort-setup’) to EVT when a template sort DAI is opened to set initial settings, which a user may modify before starting processing. Do not send the default/template pdai settings later when processing loop is running.</w:t>
       </w:r>
     </w:p>
@@ -7322,6 +7511,7 @@
         </w:numPr>
       </w:pPr>
       <w:r>
+        <w:lastRenderedPageBreak/>
         <w:t xml:space="preserve">The (*pd).pnew return is now a struct  {files:sret, stats:{}}. </w:t>
       </w:r>
     </w:p>
@@ -7492,7 +7682,6 @@
         </w:numPr>
       </w:pPr>
       <w:r>
-        <w:lastRenderedPageBreak/>
         <w:t>This is done in the event routine, so no need for a loop check in a callback routine.</w:t>
       </w:r>
     </w:p>
@@ -7870,6 +8059,7 @@
         </w:numPr>
       </w:pPr>
       <w:r>
+        <w:lastRenderedPageBreak/>
         <w:t>OnNotify</w:t>
       </w:r>
     </w:p>
@@ -8075,7 +8265,6 @@
         </w:numPr>
       </w:pPr>
       <w:r>
-        <w:lastRenderedPageBreak/>
         <w:t>‘image-process’ Notify event now uses ‘image_do_operations’, to apply incoming ops coming from the “Get” button in ‘image_process’.</w:t>
       </w:r>
     </w:p>
@@ -8421,6 +8610,7 @@
         </w:numPr>
       </w:pPr>
       <w:r>
+        <w:lastRenderedPageBreak/>
         <w:t>Image_Process_Shift_rows</w:t>
       </w:r>
       <w:r>
@@ -8567,7 +8757,6 @@
         </w:numPr>
       </w:pPr>
       <w:r>
-        <w:lastRenderedPageBreak/>
         <w:t>Added ‘dai_dir’ keyword to be able to select a different dir for output DAI files.</w:t>
       </w:r>
     </w:p>
@@ -8960,6 +9149,7 @@
         </w:numPr>
       </w:pPr>
       <w:r>
+        <w:lastRenderedPageBreak/>
         <w:t>Version 8.9</w:t>
       </w:r>
     </w:p>
@@ -9109,7 +9299,6 @@
         </w:numPr>
       </w:pPr>
       <w:r>
-        <w:lastRenderedPageBreak/>
         <w:t xml:space="preserve">“Find” used to just show </w:t>
       </w:r>
       <w:r>
@@ -9498,6 +9687,7 @@
         </w:numPr>
       </w:pPr>
       <w:r>
+        <w:lastRenderedPageBreak/>
         <w:t>Add a Device droplist to select the raw data device. Tested for “MAIA_DEVICE” and “FALCONX_MERGE_DEVICE”.</w:t>
       </w:r>
     </w:p>
@@ -9664,7 +9854,6 @@
         </w:numPr>
       </w:pPr>
       <w:r>
-        <w:lastRenderedPageBreak/>
         <w:t>APS Regolith-82 (APS List)</w:t>
       </w:r>
     </w:p>
@@ -9996,6 +10185,7 @@
         </w:numPr>
       </w:pPr>
       <w:r>
+        <w:lastRenderedPageBreak/>
         <w:t>Use same approach as for “areas” on line profiles (traverse, project, project, Spline8, etc.) to detect non-elemental image planes and great these ‘as is’ in counts, such as for “Rate” and specials as listed in “special_elements” function.</w:t>
       </w:r>
     </w:p>
@@ -10131,7 +10321,6 @@
         <w:rPr>
           <w:lang w:val="en-AU"/>
         </w:rPr>
-        <w:lastRenderedPageBreak/>
         <w:t>10 June, 2025</w:t>
       </w:r>
     </w:p>
@@ -10476,6 +10665,7 @@
         </w:numPr>
       </w:pPr>
       <w:r>
+        <w:lastRenderedPageBreak/>
         <w:t xml:space="preserve">Add ‘ShowALLregions’ to </w:t>
       </w:r>
       <w:r>
@@ -10653,7 +10843,6 @@
         </w:numPr>
       </w:pPr>
       <w:r>
-        <w:lastRenderedPageBreak/>
         <w:t>build_ebel_data</w:t>
       </w:r>
       <w:r>
@@ -11026,6 +11215,7 @@
         </w:numPr>
       </w:pPr>
       <w:r>
+        <w:lastRenderedPageBreak/>
         <w:t>And only if the Y scroll bar disappear</w:t>
       </w:r>
       <w:r>
@@ -11178,7 +11368,6 @@
         </w:numPr>
       </w:pPr>
       <w:r>
-        <w:lastRenderedPageBreak/>
         <w:t>Problem arose if manual enter parameters into layer setup (not restore from LCM).</w:t>
       </w:r>
     </w:p>
@@ -11534,6 +11723,7 @@
         </w:numPr>
       </w:pPr>
       <w:r>
+        <w:lastRenderedPageBreak/>
         <w:t>Hence, in ‘plot_maia_parameters’, do not call ‘file_requester’ between opening a new window and plotting to it.</w:t>
       </w:r>
     </w:p>
@@ -11683,7 +11873,6 @@
         <w:rPr>
           <w:lang w:val="en-AU"/>
         </w:rPr>
-        <w:lastRenderedPageBreak/>
         <w:t>12 Feb, 2025</w:t>
       </w:r>
     </w:p>
@@ -11899,6 +12088,7 @@
         </w:numPr>
       </w:pPr>
       <w:r>
+        <w:lastRenderedPageBreak/>
         <w:t>If a detector is not found on path1 (geopixe_root)</w:t>
       </w:r>
       <w:r>
@@ -12037,7 +12227,6 @@
         </w:numPr>
       </w:pPr>
       <w:r>
-        <w:lastRenderedPageBreak/>
         <w:t>On running GeoPIXE, these SAV files get loaded and write over newer versions of many routines that have been compiled (into GeoPIXE.sav) since the plugin. This of course a really bad thing, and confusing for debugging.</w:t>
       </w:r>
     </w:p>
@@ -12389,6 +12578,7 @@
         <w:rPr>
           <w:lang w:val="en-AU"/>
         </w:rPr>
+        <w:lastRenderedPageBreak/>
         <w:t>7 Jan, 2025</w:t>
       </w:r>
     </w:p>
@@ -12522,7 +12712,6 @@
         <w:rPr>
           <w:lang w:val="en-AU"/>
         </w:rPr>
-        <w:lastRenderedPageBreak/>
         <w:t>3 Dec, 2024</w:t>
       </w:r>
     </w:p>
@@ -12935,6 +13124,7 @@
         <w:rPr>
           <w:lang w:val="en-AU"/>
         </w:rPr>
+        <w:lastRenderedPageBreak/>
         <w:t>28 Oct, 2024</w:t>
       </w:r>
     </w:p>
@@ -13073,7 +13263,6 @@
         </w:numPr>
       </w:pPr>
       <w:r>
-        <w:lastRenderedPageBreak/>
         <w:t>But do these cIn lines inherit normal In rel-ints, rather than from beam lines?</w:t>
       </w:r>
     </w:p>
@@ -13527,6 +13716,7 @@
         </w:numPr>
       </w:pPr>
       <w:r>
+        <w:lastRenderedPageBreak/>
         <w:t>Compare_yields</w:t>
       </w:r>
     </w:p>
@@ -13693,7 +13883,6 @@
         </w:numPr>
       </w:pPr>
       <w:r>
-        <w:lastRenderedPageBreak/>
         <w:t xml:space="preserve">Simply prints out any inconsistencies found </w:t>
       </w:r>
       <w:r>
@@ -14049,6 +14238,7 @@
         </w:numPr>
       </w:pPr>
       <w:r>
+        <w:lastRenderedPageBreak/>
         <w:t>Add “Exp” button next to DA matrix file fields to call ‘export_DA2’ to export the chosen DA matrix for use in a data acquisition system for realtime imaging and spectra analysis.</w:t>
       </w:r>
     </w:p>
@@ -14176,7 +14366,6 @@
         </w:numPr>
       </w:pPr>
       <w:r>
-        <w:lastRenderedPageBreak/>
         <w:t>NSLS MARS Ge device</w:t>
       </w:r>
     </w:p>
@@ -14559,6 +14748,7 @@
         </w:numPr>
       </w:pPr>
       <w:r>
+        <w:lastRenderedPageBreak/>
         <w:t>Users who add plugins can also resolve their own added routines before saving a SAV file. But many basic ones can be added here</w:t>
       </w:r>
       <w:r>
@@ -14724,7 +14914,6 @@
         </w:numPr>
       </w:pPr>
       <w:r>
-        <w:lastRenderedPageBreak/>
         <w:t xml:space="preserve">i.e. It was found that you could use modal=0, floating=1 on the top base widget and </w:t>
       </w:r>
       <w:r>
@@ -15071,6 +15260,7 @@
         </w:numPr>
       </w:pPr>
       <w:r>
+        <w:lastRenderedPageBreak/>
         <w:t>Delete “continuum_Source” plugin project.</w:t>
       </w:r>
     </w:p>
@@ -15263,7 +15453,6 @@
         </w:numPr>
       </w:pPr>
       <w:r>
-        <w:lastRenderedPageBreak/>
         <w:t>‘load-source’ now handles cases of 6:lab, 7:pink beam.</w:t>
       </w:r>
     </w:p>
@@ -15638,6 +15827,7 @@
         </w:numPr>
       </w:pPr>
       <w:r>
+        <w:lastRenderedPageBreak/>
         <w:t>Add case to either ‘source_calculate’ or ‘pink_calculate’ based on beam.model</w:t>
       </w:r>
     </w:p>
@@ -15816,7 +16006,6 @@
         </w:numPr>
       </w:pPr>
       <w:r>
-        <w:lastRenderedPageBreak/>
         <w:t>Spawn_blog_parameters</w:t>
       </w:r>
     </w:p>
@@ -16227,6 +16416,7 @@
         </w:numPr>
       </w:pPr>
       <w:r>
+        <w:lastRenderedPageBreak/>
         <w:t>Image_Save_GIF</w:t>
       </w:r>
     </w:p>
@@ -16362,7 +16552,6 @@
         </w:numPr>
       </w:pPr>
       <w:r>
-        <w:lastRenderedPageBreak/>
         <w:t>Bayes.</w:t>
       </w:r>
     </w:p>
@@ -16742,6 +16931,7 @@
         </w:numPr>
       </w:pPr>
       <w:r>
+        <w:lastRenderedPageBreak/>
         <w:t>image_table_evt</w:t>
       </w:r>
     </w:p>
@@ -16958,7 +17148,6 @@
         </w:numPr>
       </w:pPr>
       <w:r>
-        <w:lastRenderedPageBreak/>
         <w:t>Use ‘builder’ (pops up index selection) to select which classes to build, which creates “build.spro” (note: this will be in “geopixe” for runtime execution and “main” for IDLDE execution).</w:t>
       </w:r>
       <w:r>
@@ -19696,6 +19885,92 @@
     </w:lvl>
   </w:abstractNum>
   <w:abstractNum w:abstractNumId="22" w15:restartNumberingAfterBreak="0">
+    <w:nsid w:val="25957A5E"/>
+    <w:multiLevelType w:val="hybridMultilevel"/>
+    <w:tmpl w:val="214CC6C4"/>
+    <w:lvl w:ilvl="0" w:tplc="FFFFFFFF">
+      <w:start w:val="1"/>
+      <w:numFmt w:val="decimal"/>
+      <w:lvlText w:val="%1."/>
+      <w:lvlJc w:val="left"/>
+      <w:pPr>
+        <w:ind w:left="720" w:hanging="360"/>
+      </w:pPr>
+    </w:lvl>
+    <w:lvl w:ilvl="1" w:tplc="FFFFFFFF">
+      <w:start w:val="1"/>
+      <w:numFmt w:val="lowerLetter"/>
+      <w:lvlText w:val="%2."/>
+      <w:lvlJc w:val="left"/>
+      <w:pPr>
+        <w:ind w:left="1440" w:hanging="360"/>
+      </w:pPr>
+    </w:lvl>
+    <w:lvl w:ilvl="2" w:tplc="FFFFFFFF">
+      <w:start w:val="1"/>
+      <w:numFmt w:val="lowerRoman"/>
+      <w:lvlText w:val="%3."/>
+      <w:lvlJc w:val="right"/>
+      <w:pPr>
+        <w:ind w:left="2160" w:hanging="180"/>
+      </w:pPr>
+    </w:lvl>
+    <w:lvl w:ilvl="3" w:tplc="FFFFFFFF">
+      <w:start w:val="1"/>
+      <w:numFmt w:val="decimal"/>
+      <w:lvlText w:val="%4."/>
+      <w:lvlJc w:val="left"/>
+      <w:pPr>
+        <w:ind w:left="2880" w:hanging="360"/>
+      </w:pPr>
+    </w:lvl>
+    <w:lvl w:ilvl="4" w:tplc="FFFFFFFF">
+      <w:start w:val="1"/>
+      <w:numFmt w:val="lowerLetter"/>
+      <w:lvlText w:val="%5."/>
+      <w:lvlJc w:val="left"/>
+      <w:pPr>
+        <w:ind w:left="3600" w:hanging="360"/>
+      </w:pPr>
+    </w:lvl>
+    <w:lvl w:ilvl="5" w:tplc="FFFFFFFF">
+      <w:start w:val="1"/>
+      <w:numFmt w:val="lowerRoman"/>
+      <w:lvlText w:val="%6."/>
+      <w:lvlJc w:val="right"/>
+      <w:pPr>
+        <w:ind w:left="4320" w:hanging="180"/>
+      </w:pPr>
+    </w:lvl>
+    <w:lvl w:ilvl="6" w:tplc="FFFFFFFF" w:tentative="1">
+      <w:start w:val="1"/>
+      <w:numFmt w:val="decimal"/>
+      <w:lvlText w:val="%7."/>
+      <w:lvlJc w:val="left"/>
+      <w:pPr>
+        <w:ind w:left="5040" w:hanging="360"/>
+      </w:pPr>
+    </w:lvl>
+    <w:lvl w:ilvl="7" w:tplc="FFFFFFFF" w:tentative="1">
+      <w:start w:val="1"/>
+      <w:numFmt w:val="lowerLetter"/>
+      <w:lvlText w:val="%8."/>
+      <w:lvlJc w:val="left"/>
+      <w:pPr>
+        <w:ind w:left="5760" w:hanging="360"/>
+      </w:pPr>
+    </w:lvl>
+    <w:lvl w:ilvl="8" w:tplc="FFFFFFFF" w:tentative="1">
+      <w:start w:val="1"/>
+      <w:numFmt w:val="lowerRoman"/>
+      <w:lvlText w:val="%9."/>
+      <w:lvlJc w:val="right"/>
+      <w:pPr>
+        <w:ind w:left="6480" w:hanging="180"/>
+      </w:pPr>
+    </w:lvl>
+  </w:abstractNum>
+  <w:abstractNum w:abstractNumId="23" w15:restartNumberingAfterBreak="0">
     <w:nsid w:val="275B156F"/>
     <w:multiLevelType w:val="hybridMultilevel"/>
     <w:tmpl w:val="214CC6C4"/>
@@ -19781,7 +20056,7 @@
       </w:pPr>
     </w:lvl>
   </w:abstractNum>
-  <w:abstractNum w:abstractNumId="23" w15:restartNumberingAfterBreak="0">
+  <w:abstractNum w:abstractNumId="24" w15:restartNumberingAfterBreak="0">
     <w:nsid w:val="28090D24"/>
     <w:multiLevelType w:val="hybridMultilevel"/>
     <w:tmpl w:val="214CC6C4"/>
@@ -19867,7 +20142,7 @@
       </w:pPr>
     </w:lvl>
   </w:abstractNum>
-  <w:abstractNum w:abstractNumId="24" w15:restartNumberingAfterBreak="0">
+  <w:abstractNum w:abstractNumId="25" w15:restartNumberingAfterBreak="0">
     <w:nsid w:val="2BBE5C5D"/>
     <w:multiLevelType w:val="hybridMultilevel"/>
     <w:tmpl w:val="214CC6C4"/>
@@ -19953,7 +20228,7 @@
       </w:pPr>
     </w:lvl>
   </w:abstractNum>
-  <w:abstractNum w:abstractNumId="25" w15:restartNumberingAfterBreak="0">
+  <w:abstractNum w:abstractNumId="26" w15:restartNumberingAfterBreak="0">
     <w:nsid w:val="2ED42603"/>
     <w:multiLevelType w:val="hybridMultilevel"/>
     <w:tmpl w:val="214CC6C4"/>
@@ -20039,7 +20314,7 @@
       </w:pPr>
     </w:lvl>
   </w:abstractNum>
-  <w:abstractNum w:abstractNumId="26" w15:restartNumberingAfterBreak="0">
+  <w:abstractNum w:abstractNumId="27" w15:restartNumberingAfterBreak="0">
     <w:nsid w:val="2F545F49"/>
     <w:multiLevelType w:val="hybridMultilevel"/>
     <w:tmpl w:val="214CC6C4"/>
@@ -20125,7 +20400,7 @@
       </w:pPr>
     </w:lvl>
   </w:abstractNum>
-  <w:abstractNum w:abstractNumId="27" w15:restartNumberingAfterBreak="0">
+  <w:abstractNum w:abstractNumId="28" w15:restartNumberingAfterBreak="0">
     <w:nsid w:val="2F731835"/>
     <w:multiLevelType w:val="hybridMultilevel"/>
     <w:tmpl w:val="214CC6C4"/>
@@ -20211,7 +20486,7 @@
       </w:pPr>
     </w:lvl>
   </w:abstractNum>
-  <w:abstractNum w:abstractNumId="28" w15:restartNumberingAfterBreak="0">
+  <w:abstractNum w:abstractNumId="29" w15:restartNumberingAfterBreak="0">
     <w:nsid w:val="32326CBE"/>
     <w:multiLevelType w:val="hybridMultilevel"/>
     <w:tmpl w:val="214CC6C4"/>
@@ -20297,7 +20572,7 @@
       </w:pPr>
     </w:lvl>
   </w:abstractNum>
-  <w:abstractNum w:abstractNumId="29" w15:restartNumberingAfterBreak="0">
+  <w:abstractNum w:abstractNumId="30" w15:restartNumberingAfterBreak="0">
     <w:nsid w:val="32A949EB"/>
     <w:multiLevelType w:val="hybridMultilevel"/>
     <w:tmpl w:val="214CC6C4"/>
@@ -20383,7 +20658,7 @@
       </w:pPr>
     </w:lvl>
   </w:abstractNum>
-  <w:abstractNum w:abstractNumId="30" w15:restartNumberingAfterBreak="0">
+  <w:abstractNum w:abstractNumId="31" w15:restartNumberingAfterBreak="0">
     <w:nsid w:val="33231170"/>
     <w:multiLevelType w:val="hybridMultilevel"/>
     <w:tmpl w:val="214CC6C4"/>
@@ -20469,7 +20744,7 @@
       </w:pPr>
     </w:lvl>
   </w:abstractNum>
-  <w:abstractNum w:abstractNumId="31" w15:restartNumberingAfterBreak="0">
+  <w:abstractNum w:abstractNumId="32" w15:restartNumberingAfterBreak="0">
     <w:nsid w:val="335B6E8D"/>
     <w:multiLevelType w:val="hybridMultilevel"/>
     <w:tmpl w:val="214CC6C4"/>
@@ -20555,7 +20830,7 @@
       </w:pPr>
     </w:lvl>
   </w:abstractNum>
-  <w:abstractNum w:abstractNumId="32" w15:restartNumberingAfterBreak="0">
+  <w:abstractNum w:abstractNumId="33" w15:restartNumberingAfterBreak="0">
     <w:nsid w:val="355B2568"/>
     <w:multiLevelType w:val="hybridMultilevel"/>
     <w:tmpl w:val="214CC6C4"/>
@@ -20641,7 +20916,7 @@
       </w:pPr>
     </w:lvl>
   </w:abstractNum>
-  <w:abstractNum w:abstractNumId="33" w15:restartNumberingAfterBreak="0">
+  <w:abstractNum w:abstractNumId="34" w15:restartNumberingAfterBreak="0">
     <w:nsid w:val="356645B8"/>
     <w:multiLevelType w:val="hybridMultilevel"/>
     <w:tmpl w:val="214CC6C4"/>
@@ -20727,7 +21002,7 @@
       </w:pPr>
     </w:lvl>
   </w:abstractNum>
-  <w:abstractNum w:abstractNumId="34" w15:restartNumberingAfterBreak="0">
+  <w:abstractNum w:abstractNumId="35" w15:restartNumberingAfterBreak="0">
     <w:nsid w:val="35B806D1"/>
     <w:multiLevelType w:val="hybridMultilevel"/>
     <w:tmpl w:val="214CC6C4"/>
@@ -20813,7 +21088,93 @@
       </w:pPr>
     </w:lvl>
   </w:abstractNum>
-  <w:abstractNum w:abstractNumId="35" w15:restartNumberingAfterBreak="0">
+  <w:abstractNum w:abstractNumId="36" w15:restartNumberingAfterBreak="0">
+    <w:nsid w:val="364E1BD1"/>
+    <w:multiLevelType w:val="hybridMultilevel"/>
+    <w:tmpl w:val="214CC6C4"/>
+    <w:lvl w:ilvl="0" w:tplc="FFFFFFFF">
+      <w:start w:val="1"/>
+      <w:numFmt w:val="decimal"/>
+      <w:lvlText w:val="%1."/>
+      <w:lvlJc w:val="left"/>
+      <w:pPr>
+        <w:ind w:left="720" w:hanging="360"/>
+      </w:pPr>
+    </w:lvl>
+    <w:lvl w:ilvl="1" w:tplc="FFFFFFFF">
+      <w:start w:val="1"/>
+      <w:numFmt w:val="lowerLetter"/>
+      <w:lvlText w:val="%2."/>
+      <w:lvlJc w:val="left"/>
+      <w:pPr>
+        <w:ind w:left="1440" w:hanging="360"/>
+      </w:pPr>
+    </w:lvl>
+    <w:lvl w:ilvl="2" w:tplc="FFFFFFFF">
+      <w:start w:val="1"/>
+      <w:numFmt w:val="lowerRoman"/>
+      <w:lvlText w:val="%3."/>
+      <w:lvlJc w:val="right"/>
+      <w:pPr>
+        <w:ind w:left="2160" w:hanging="180"/>
+      </w:pPr>
+    </w:lvl>
+    <w:lvl w:ilvl="3" w:tplc="FFFFFFFF">
+      <w:start w:val="1"/>
+      <w:numFmt w:val="decimal"/>
+      <w:lvlText w:val="%4."/>
+      <w:lvlJc w:val="left"/>
+      <w:pPr>
+        <w:ind w:left="2880" w:hanging="360"/>
+      </w:pPr>
+    </w:lvl>
+    <w:lvl w:ilvl="4" w:tplc="FFFFFFFF">
+      <w:start w:val="1"/>
+      <w:numFmt w:val="lowerLetter"/>
+      <w:lvlText w:val="%5."/>
+      <w:lvlJc w:val="left"/>
+      <w:pPr>
+        <w:ind w:left="3600" w:hanging="360"/>
+      </w:pPr>
+    </w:lvl>
+    <w:lvl w:ilvl="5" w:tplc="FFFFFFFF">
+      <w:start w:val="1"/>
+      <w:numFmt w:val="lowerRoman"/>
+      <w:lvlText w:val="%6."/>
+      <w:lvlJc w:val="right"/>
+      <w:pPr>
+        <w:ind w:left="4320" w:hanging="180"/>
+      </w:pPr>
+    </w:lvl>
+    <w:lvl w:ilvl="6" w:tplc="FFFFFFFF" w:tentative="1">
+      <w:start w:val="1"/>
+      <w:numFmt w:val="decimal"/>
+      <w:lvlText w:val="%7."/>
+      <w:lvlJc w:val="left"/>
+      <w:pPr>
+        <w:ind w:left="5040" w:hanging="360"/>
+      </w:pPr>
+    </w:lvl>
+    <w:lvl w:ilvl="7" w:tplc="FFFFFFFF" w:tentative="1">
+      <w:start w:val="1"/>
+      <w:numFmt w:val="lowerLetter"/>
+      <w:lvlText w:val="%8."/>
+      <w:lvlJc w:val="left"/>
+      <w:pPr>
+        <w:ind w:left="5760" w:hanging="360"/>
+      </w:pPr>
+    </w:lvl>
+    <w:lvl w:ilvl="8" w:tplc="FFFFFFFF" w:tentative="1">
+      <w:start w:val="1"/>
+      <w:numFmt w:val="lowerRoman"/>
+      <w:lvlText w:val="%9."/>
+      <w:lvlJc w:val="right"/>
+      <w:pPr>
+        <w:ind w:left="6480" w:hanging="180"/>
+      </w:pPr>
+    </w:lvl>
+  </w:abstractNum>
+  <w:abstractNum w:abstractNumId="37" w15:restartNumberingAfterBreak="0">
     <w:nsid w:val="37C0055A"/>
     <w:multiLevelType w:val="hybridMultilevel"/>
     <w:tmpl w:val="214CC6C4"/>
@@ -20899,7 +21260,7 @@
       </w:pPr>
     </w:lvl>
   </w:abstractNum>
-  <w:abstractNum w:abstractNumId="36" w15:restartNumberingAfterBreak="0">
+  <w:abstractNum w:abstractNumId="38" w15:restartNumberingAfterBreak="0">
     <w:nsid w:val="383C1F2F"/>
     <w:multiLevelType w:val="hybridMultilevel"/>
     <w:tmpl w:val="214CC6C4"/>
@@ -20985,7 +21346,7 @@
       </w:pPr>
     </w:lvl>
   </w:abstractNum>
-  <w:abstractNum w:abstractNumId="37" w15:restartNumberingAfterBreak="0">
+  <w:abstractNum w:abstractNumId="39" w15:restartNumberingAfterBreak="0">
     <w:nsid w:val="38677977"/>
     <w:multiLevelType w:val="hybridMultilevel"/>
     <w:tmpl w:val="214CC6C4"/>
@@ -21071,7 +21432,7 @@
       </w:pPr>
     </w:lvl>
   </w:abstractNum>
-  <w:abstractNum w:abstractNumId="38" w15:restartNumberingAfterBreak="0">
+  <w:abstractNum w:abstractNumId="40" w15:restartNumberingAfterBreak="0">
     <w:nsid w:val="39E017C7"/>
     <w:multiLevelType w:val="hybridMultilevel"/>
     <w:tmpl w:val="214CC6C4"/>
@@ -21157,7 +21518,7 @@
       </w:pPr>
     </w:lvl>
   </w:abstractNum>
-  <w:abstractNum w:abstractNumId="39" w15:restartNumberingAfterBreak="0">
+  <w:abstractNum w:abstractNumId="41" w15:restartNumberingAfterBreak="0">
     <w:nsid w:val="3A906D54"/>
     <w:multiLevelType w:val="hybridMultilevel"/>
     <w:tmpl w:val="214CC6C4"/>
@@ -21243,7 +21604,7 @@
       </w:pPr>
     </w:lvl>
   </w:abstractNum>
-  <w:abstractNum w:abstractNumId="40" w15:restartNumberingAfterBreak="0">
+  <w:abstractNum w:abstractNumId="42" w15:restartNumberingAfterBreak="0">
     <w:nsid w:val="3D360724"/>
     <w:multiLevelType w:val="hybridMultilevel"/>
     <w:tmpl w:val="214CC6C4"/>
@@ -21329,7 +21690,7 @@
       </w:pPr>
     </w:lvl>
   </w:abstractNum>
-  <w:abstractNum w:abstractNumId="41" w15:restartNumberingAfterBreak="0">
+  <w:abstractNum w:abstractNumId="43" w15:restartNumberingAfterBreak="0">
     <w:nsid w:val="3DF10524"/>
     <w:multiLevelType w:val="hybridMultilevel"/>
     <w:tmpl w:val="214CC6C4"/>
@@ -21415,7 +21776,7 @@
       </w:pPr>
     </w:lvl>
   </w:abstractNum>
-  <w:abstractNum w:abstractNumId="42" w15:restartNumberingAfterBreak="0">
+  <w:abstractNum w:abstractNumId="44" w15:restartNumberingAfterBreak="0">
     <w:nsid w:val="3F097101"/>
     <w:multiLevelType w:val="hybridMultilevel"/>
     <w:tmpl w:val="214CC6C4"/>
@@ -21501,7 +21862,7 @@
       </w:pPr>
     </w:lvl>
   </w:abstractNum>
-  <w:abstractNum w:abstractNumId="43" w15:restartNumberingAfterBreak="0">
+  <w:abstractNum w:abstractNumId="45" w15:restartNumberingAfterBreak="0">
     <w:nsid w:val="41A638B2"/>
     <w:multiLevelType w:val="hybridMultilevel"/>
     <w:tmpl w:val="214CC6C4"/>
@@ -21587,7 +21948,7 @@
       </w:pPr>
     </w:lvl>
   </w:abstractNum>
-  <w:abstractNum w:abstractNumId="44" w15:restartNumberingAfterBreak="0">
+  <w:abstractNum w:abstractNumId="46" w15:restartNumberingAfterBreak="0">
     <w:nsid w:val="420D41AB"/>
     <w:multiLevelType w:val="hybridMultilevel"/>
     <w:tmpl w:val="214CC6C4"/>
@@ -21673,7 +22034,7 @@
       </w:pPr>
     </w:lvl>
   </w:abstractNum>
-  <w:abstractNum w:abstractNumId="45" w15:restartNumberingAfterBreak="0">
+  <w:abstractNum w:abstractNumId="47" w15:restartNumberingAfterBreak="0">
     <w:nsid w:val="436129C1"/>
     <w:multiLevelType w:val="hybridMultilevel"/>
     <w:tmpl w:val="214CC6C4"/>
@@ -21759,7 +22120,7 @@
       </w:pPr>
     </w:lvl>
   </w:abstractNum>
-  <w:abstractNum w:abstractNumId="46" w15:restartNumberingAfterBreak="0">
+  <w:abstractNum w:abstractNumId="48" w15:restartNumberingAfterBreak="0">
     <w:nsid w:val="438D310E"/>
     <w:multiLevelType w:val="hybridMultilevel"/>
     <w:tmpl w:val="3DFEBE78"/>
@@ -21845,7 +22206,7 @@
       </w:pPr>
     </w:lvl>
   </w:abstractNum>
-  <w:abstractNum w:abstractNumId="47" w15:restartNumberingAfterBreak="0">
+  <w:abstractNum w:abstractNumId="49" w15:restartNumberingAfterBreak="0">
     <w:nsid w:val="45F80AA2"/>
     <w:multiLevelType w:val="hybridMultilevel"/>
     <w:tmpl w:val="214CC6C4"/>
@@ -21931,7 +22292,7 @@
       </w:pPr>
     </w:lvl>
   </w:abstractNum>
-  <w:abstractNum w:abstractNumId="48" w15:restartNumberingAfterBreak="0">
+  <w:abstractNum w:abstractNumId="50" w15:restartNumberingAfterBreak="0">
     <w:nsid w:val="46D104B0"/>
     <w:multiLevelType w:val="hybridMultilevel"/>
     <w:tmpl w:val="214CC6C4"/>
@@ -22017,7 +22378,7 @@
       </w:pPr>
     </w:lvl>
   </w:abstractNum>
-  <w:abstractNum w:abstractNumId="49" w15:restartNumberingAfterBreak="0">
+  <w:abstractNum w:abstractNumId="51" w15:restartNumberingAfterBreak="0">
     <w:nsid w:val="47C63F90"/>
     <w:multiLevelType w:val="hybridMultilevel"/>
     <w:tmpl w:val="214CC6C4"/>
@@ -22103,7 +22464,7 @@
       </w:pPr>
     </w:lvl>
   </w:abstractNum>
-  <w:abstractNum w:abstractNumId="50" w15:restartNumberingAfterBreak="0">
+  <w:abstractNum w:abstractNumId="52" w15:restartNumberingAfterBreak="0">
     <w:nsid w:val="48424B8D"/>
     <w:multiLevelType w:val="hybridMultilevel"/>
     <w:tmpl w:val="214CC6C4"/>
@@ -22189,7 +22550,7 @@
       </w:pPr>
     </w:lvl>
   </w:abstractNum>
-  <w:abstractNum w:abstractNumId="51" w15:restartNumberingAfterBreak="0">
+  <w:abstractNum w:abstractNumId="53" w15:restartNumberingAfterBreak="0">
     <w:nsid w:val="48E719F4"/>
     <w:multiLevelType w:val="hybridMultilevel"/>
     <w:tmpl w:val="214CC6C4"/>
@@ -22275,7 +22636,7 @@
       </w:pPr>
     </w:lvl>
   </w:abstractNum>
-  <w:abstractNum w:abstractNumId="52" w15:restartNumberingAfterBreak="0">
+  <w:abstractNum w:abstractNumId="54" w15:restartNumberingAfterBreak="0">
     <w:nsid w:val="4A276C6F"/>
     <w:multiLevelType w:val="hybridMultilevel"/>
     <w:tmpl w:val="214CC6C4"/>
@@ -22361,7 +22722,7 @@
       </w:pPr>
     </w:lvl>
   </w:abstractNum>
-  <w:abstractNum w:abstractNumId="53" w15:restartNumberingAfterBreak="0">
+  <w:abstractNum w:abstractNumId="55" w15:restartNumberingAfterBreak="0">
     <w:nsid w:val="4ACD66FA"/>
     <w:multiLevelType w:val="hybridMultilevel"/>
     <w:tmpl w:val="214CC6C4"/>
@@ -22447,7 +22808,7 @@
       </w:pPr>
     </w:lvl>
   </w:abstractNum>
-  <w:abstractNum w:abstractNumId="54" w15:restartNumberingAfterBreak="0">
+  <w:abstractNum w:abstractNumId="56" w15:restartNumberingAfterBreak="0">
     <w:nsid w:val="4B205F99"/>
     <w:multiLevelType w:val="hybridMultilevel"/>
     <w:tmpl w:val="214CC6C4"/>
@@ -22533,7 +22894,7 @@
       </w:pPr>
     </w:lvl>
   </w:abstractNum>
-  <w:abstractNum w:abstractNumId="55" w15:restartNumberingAfterBreak="0">
+  <w:abstractNum w:abstractNumId="57" w15:restartNumberingAfterBreak="0">
     <w:nsid w:val="4B7F04E2"/>
     <w:multiLevelType w:val="hybridMultilevel"/>
     <w:tmpl w:val="214CC6C4"/>
@@ -22619,7 +22980,7 @@
       </w:pPr>
     </w:lvl>
   </w:abstractNum>
-  <w:abstractNum w:abstractNumId="56" w15:restartNumberingAfterBreak="0">
+  <w:abstractNum w:abstractNumId="58" w15:restartNumberingAfterBreak="0">
     <w:nsid w:val="4D9A4F4C"/>
     <w:multiLevelType w:val="hybridMultilevel"/>
     <w:tmpl w:val="214CC6C4"/>
@@ -22705,7 +23066,7 @@
       </w:pPr>
     </w:lvl>
   </w:abstractNum>
-  <w:abstractNum w:abstractNumId="57" w15:restartNumberingAfterBreak="0">
+  <w:abstractNum w:abstractNumId="59" w15:restartNumberingAfterBreak="0">
     <w:nsid w:val="4FB81408"/>
     <w:multiLevelType w:val="hybridMultilevel"/>
     <w:tmpl w:val="214CC6C4"/>
@@ -22791,7 +23152,7 @@
       </w:pPr>
     </w:lvl>
   </w:abstractNum>
-  <w:abstractNum w:abstractNumId="58" w15:restartNumberingAfterBreak="0">
+  <w:abstractNum w:abstractNumId="60" w15:restartNumberingAfterBreak="0">
     <w:nsid w:val="56833A85"/>
     <w:multiLevelType w:val="hybridMultilevel"/>
     <w:tmpl w:val="214CC6C4"/>
@@ -22877,7 +23238,7 @@
       </w:pPr>
     </w:lvl>
   </w:abstractNum>
-  <w:abstractNum w:abstractNumId="59" w15:restartNumberingAfterBreak="0">
+  <w:abstractNum w:abstractNumId="61" w15:restartNumberingAfterBreak="0">
     <w:nsid w:val="56C643E7"/>
     <w:multiLevelType w:val="hybridMultilevel"/>
     <w:tmpl w:val="214CC6C4"/>
@@ -22963,7 +23324,7 @@
       </w:pPr>
     </w:lvl>
   </w:abstractNum>
-  <w:abstractNum w:abstractNumId="60" w15:restartNumberingAfterBreak="0">
+  <w:abstractNum w:abstractNumId="62" w15:restartNumberingAfterBreak="0">
     <w:nsid w:val="59654531"/>
     <w:multiLevelType w:val="hybridMultilevel"/>
     <w:tmpl w:val="214CC6C4"/>
@@ -23049,7 +23410,7 @@
       </w:pPr>
     </w:lvl>
   </w:abstractNum>
-  <w:abstractNum w:abstractNumId="61" w15:restartNumberingAfterBreak="0">
+  <w:abstractNum w:abstractNumId="63" w15:restartNumberingAfterBreak="0">
     <w:nsid w:val="59CA6D97"/>
     <w:multiLevelType w:val="hybridMultilevel"/>
     <w:tmpl w:val="214CC6C4"/>
@@ -23135,7 +23496,7 @@
       </w:pPr>
     </w:lvl>
   </w:abstractNum>
-  <w:abstractNum w:abstractNumId="62" w15:restartNumberingAfterBreak="0">
+  <w:abstractNum w:abstractNumId="64" w15:restartNumberingAfterBreak="0">
     <w:nsid w:val="60085356"/>
     <w:multiLevelType w:val="hybridMultilevel"/>
     <w:tmpl w:val="214CC6C4"/>
@@ -23221,7 +23582,7 @@
       </w:pPr>
     </w:lvl>
   </w:abstractNum>
-  <w:abstractNum w:abstractNumId="63" w15:restartNumberingAfterBreak="0">
+  <w:abstractNum w:abstractNumId="65" w15:restartNumberingAfterBreak="0">
     <w:nsid w:val="61513B38"/>
     <w:multiLevelType w:val="hybridMultilevel"/>
     <w:tmpl w:val="4D926568"/>
@@ -23307,7 +23668,7 @@
       </w:pPr>
     </w:lvl>
   </w:abstractNum>
-  <w:abstractNum w:abstractNumId="64" w15:restartNumberingAfterBreak="0">
+  <w:abstractNum w:abstractNumId="66" w15:restartNumberingAfterBreak="0">
     <w:nsid w:val="62686DE9"/>
     <w:multiLevelType w:val="hybridMultilevel"/>
     <w:tmpl w:val="214CC6C4"/>
@@ -23393,7 +23754,7 @@
       </w:pPr>
     </w:lvl>
   </w:abstractNum>
-  <w:abstractNum w:abstractNumId="65" w15:restartNumberingAfterBreak="0">
+  <w:abstractNum w:abstractNumId="67" w15:restartNumberingAfterBreak="0">
     <w:nsid w:val="64B53F9E"/>
     <w:multiLevelType w:val="hybridMultilevel"/>
     <w:tmpl w:val="214CC6C4"/>
@@ -23479,7 +23840,7 @@
       </w:pPr>
     </w:lvl>
   </w:abstractNum>
-  <w:abstractNum w:abstractNumId="66" w15:restartNumberingAfterBreak="0">
+  <w:abstractNum w:abstractNumId="68" w15:restartNumberingAfterBreak="0">
     <w:nsid w:val="64EC6FC0"/>
     <w:multiLevelType w:val="hybridMultilevel"/>
     <w:tmpl w:val="214CC6C4"/>
@@ -23565,7 +23926,7 @@
       </w:pPr>
     </w:lvl>
   </w:abstractNum>
-  <w:abstractNum w:abstractNumId="67" w15:restartNumberingAfterBreak="0">
+  <w:abstractNum w:abstractNumId="69" w15:restartNumberingAfterBreak="0">
     <w:nsid w:val="65466AFA"/>
     <w:multiLevelType w:val="hybridMultilevel"/>
     <w:tmpl w:val="214CC6C4"/>
@@ -23651,7 +24012,7 @@
       </w:pPr>
     </w:lvl>
   </w:abstractNum>
-  <w:abstractNum w:abstractNumId="68" w15:restartNumberingAfterBreak="0">
+  <w:abstractNum w:abstractNumId="70" w15:restartNumberingAfterBreak="0">
     <w:nsid w:val="65972C68"/>
     <w:multiLevelType w:val="hybridMultilevel"/>
     <w:tmpl w:val="214CC6C4"/>
@@ -23737,7 +24098,7 @@
       </w:pPr>
     </w:lvl>
   </w:abstractNum>
-  <w:abstractNum w:abstractNumId="69" w15:restartNumberingAfterBreak="0">
+  <w:abstractNum w:abstractNumId="71" w15:restartNumberingAfterBreak="0">
     <w:nsid w:val="68167485"/>
     <w:multiLevelType w:val="hybridMultilevel"/>
     <w:tmpl w:val="214CC6C4"/>
@@ -23823,7 +24184,7 @@
       </w:pPr>
     </w:lvl>
   </w:abstractNum>
-  <w:abstractNum w:abstractNumId="70" w15:restartNumberingAfterBreak="0">
+  <w:abstractNum w:abstractNumId="72" w15:restartNumberingAfterBreak="0">
     <w:nsid w:val="692A3DFA"/>
     <w:multiLevelType w:val="hybridMultilevel"/>
     <w:tmpl w:val="214CC6C4"/>
@@ -23909,7 +24270,7 @@
       </w:pPr>
     </w:lvl>
   </w:abstractNum>
-  <w:abstractNum w:abstractNumId="71" w15:restartNumberingAfterBreak="0">
+  <w:abstractNum w:abstractNumId="73" w15:restartNumberingAfterBreak="0">
     <w:nsid w:val="6AD95314"/>
     <w:multiLevelType w:val="hybridMultilevel"/>
     <w:tmpl w:val="214CC6C4"/>
@@ -23995,7 +24356,7 @@
       </w:pPr>
     </w:lvl>
   </w:abstractNum>
-  <w:abstractNum w:abstractNumId="72" w15:restartNumberingAfterBreak="0">
+  <w:abstractNum w:abstractNumId="74" w15:restartNumberingAfterBreak="0">
     <w:nsid w:val="6B085590"/>
     <w:multiLevelType w:val="hybridMultilevel"/>
     <w:tmpl w:val="214CC6C4"/>
@@ -24081,7 +24442,7 @@
       </w:pPr>
     </w:lvl>
   </w:abstractNum>
-  <w:abstractNum w:abstractNumId="73" w15:restartNumberingAfterBreak="0">
+  <w:abstractNum w:abstractNumId="75" w15:restartNumberingAfterBreak="0">
     <w:nsid w:val="6C802E67"/>
     <w:multiLevelType w:val="hybridMultilevel"/>
     <w:tmpl w:val="214CC6C4"/>
@@ -24167,7 +24528,7 @@
       </w:pPr>
     </w:lvl>
   </w:abstractNum>
-  <w:abstractNum w:abstractNumId="74" w15:restartNumberingAfterBreak="0">
+  <w:abstractNum w:abstractNumId="76" w15:restartNumberingAfterBreak="0">
     <w:nsid w:val="6EC96476"/>
     <w:multiLevelType w:val="hybridMultilevel"/>
     <w:tmpl w:val="3DFEBE78"/>
@@ -24253,7 +24614,7 @@
       </w:pPr>
     </w:lvl>
   </w:abstractNum>
-  <w:abstractNum w:abstractNumId="75" w15:restartNumberingAfterBreak="0">
+  <w:abstractNum w:abstractNumId="77" w15:restartNumberingAfterBreak="0">
     <w:nsid w:val="726B52C1"/>
     <w:multiLevelType w:val="hybridMultilevel"/>
     <w:tmpl w:val="214CC6C4"/>
@@ -24339,7 +24700,7 @@
       </w:pPr>
     </w:lvl>
   </w:abstractNum>
-  <w:abstractNum w:abstractNumId="76" w15:restartNumberingAfterBreak="0">
+  <w:abstractNum w:abstractNumId="78" w15:restartNumberingAfterBreak="0">
     <w:nsid w:val="728B0421"/>
     <w:multiLevelType w:val="hybridMultilevel"/>
     <w:tmpl w:val="214CC6C4"/>
@@ -24425,7 +24786,7 @@
       </w:pPr>
     </w:lvl>
   </w:abstractNum>
-  <w:abstractNum w:abstractNumId="77" w15:restartNumberingAfterBreak="0">
+  <w:abstractNum w:abstractNumId="79" w15:restartNumberingAfterBreak="0">
     <w:nsid w:val="73401E16"/>
     <w:multiLevelType w:val="hybridMultilevel"/>
     <w:tmpl w:val="214CC6C4"/>
@@ -24511,7 +24872,7 @@
       </w:pPr>
     </w:lvl>
   </w:abstractNum>
-  <w:abstractNum w:abstractNumId="78" w15:restartNumberingAfterBreak="0">
+  <w:abstractNum w:abstractNumId="80" w15:restartNumberingAfterBreak="0">
     <w:nsid w:val="75336A05"/>
     <w:multiLevelType w:val="hybridMultilevel"/>
     <w:tmpl w:val="214CC6C4"/>
@@ -24597,7 +24958,7 @@
       </w:pPr>
     </w:lvl>
   </w:abstractNum>
-  <w:abstractNum w:abstractNumId="79" w15:restartNumberingAfterBreak="0">
+  <w:abstractNum w:abstractNumId="81" w15:restartNumberingAfterBreak="0">
     <w:nsid w:val="779B3DB6"/>
     <w:multiLevelType w:val="hybridMultilevel"/>
     <w:tmpl w:val="214CC6C4"/>
@@ -24683,7 +25044,7 @@
       </w:pPr>
     </w:lvl>
   </w:abstractNum>
-  <w:abstractNum w:abstractNumId="80" w15:restartNumberingAfterBreak="0">
+  <w:abstractNum w:abstractNumId="82" w15:restartNumberingAfterBreak="0">
     <w:nsid w:val="7B23524C"/>
     <w:multiLevelType w:val="hybridMultilevel"/>
     <w:tmpl w:val="214CC6C4"/>
@@ -24769,7 +25130,7 @@
       </w:pPr>
     </w:lvl>
   </w:abstractNum>
-  <w:abstractNum w:abstractNumId="81" w15:restartNumberingAfterBreak="0">
+  <w:abstractNum w:abstractNumId="83" w15:restartNumberingAfterBreak="0">
     <w:nsid w:val="7B8572AA"/>
     <w:multiLevelType w:val="hybridMultilevel"/>
     <w:tmpl w:val="214CC6C4"/>
@@ -24855,7 +25216,7 @@
       </w:pPr>
     </w:lvl>
   </w:abstractNum>
-  <w:abstractNum w:abstractNumId="82" w15:restartNumberingAfterBreak="0">
+  <w:abstractNum w:abstractNumId="84" w15:restartNumberingAfterBreak="0">
     <w:nsid w:val="7BD85F1F"/>
     <w:multiLevelType w:val="hybridMultilevel"/>
     <w:tmpl w:val="214CC6C4"/>
@@ -24941,7 +25302,7 @@
       </w:pPr>
     </w:lvl>
   </w:abstractNum>
-  <w:abstractNum w:abstractNumId="83" w15:restartNumberingAfterBreak="0">
+  <w:abstractNum w:abstractNumId="85" w15:restartNumberingAfterBreak="0">
     <w:nsid w:val="7BE25365"/>
     <w:multiLevelType w:val="hybridMultilevel"/>
     <w:tmpl w:val="214CC6C4"/>
@@ -25028,22 +25389,22 @@
     </w:lvl>
   </w:abstractNum>
   <w:num w:numId="1" w16cid:durableId="689641893">
-    <w:abstractNumId w:val="41"/>
+    <w:abstractNumId w:val="43"/>
   </w:num>
   <w:num w:numId="2" w16cid:durableId="1714230517">
-    <w:abstractNumId w:val="58"/>
+    <w:abstractNumId w:val="60"/>
   </w:num>
   <w:num w:numId="3" w16cid:durableId="602418336">
-    <w:abstractNumId w:val="34"/>
+    <w:abstractNumId w:val="35"/>
   </w:num>
   <w:num w:numId="4" w16cid:durableId="319892333">
-    <w:abstractNumId w:val="63"/>
+    <w:abstractNumId w:val="65"/>
   </w:num>
   <w:num w:numId="5" w16cid:durableId="1682078939">
-    <w:abstractNumId w:val="69"/>
+    <w:abstractNumId w:val="71"/>
   </w:num>
   <w:num w:numId="6" w16cid:durableId="69352654">
-    <w:abstractNumId w:val="83"/>
+    <w:abstractNumId w:val="85"/>
   </w:num>
   <w:num w:numId="7" w16cid:durableId="399905843">
     <w:abstractNumId w:val="7"/>
@@ -25058,49 +25419,49 @@
     <w:abstractNumId w:val="5"/>
   </w:num>
   <w:num w:numId="11" w16cid:durableId="618218708">
-    <w:abstractNumId w:val="52"/>
+    <w:abstractNumId w:val="54"/>
   </w:num>
   <w:num w:numId="12" w16cid:durableId="1832019268">
-    <w:abstractNumId w:val="38"/>
+    <w:abstractNumId w:val="40"/>
   </w:num>
   <w:num w:numId="13" w16cid:durableId="2082213922">
-    <w:abstractNumId w:val="39"/>
+    <w:abstractNumId w:val="41"/>
   </w:num>
   <w:num w:numId="14" w16cid:durableId="1738477231">
-    <w:abstractNumId w:val="31"/>
+    <w:abstractNumId w:val="32"/>
   </w:num>
   <w:num w:numId="15" w16cid:durableId="1288660286">
-    <w:abstractNumId w:val="43"/>
+    <w:abstractNumId w:val="45"/>
   </w:num>
   <w:num w:numId="16" w16cid:durableId="1466973576">
-    <w:abstractNumId w:val="53"/>
+    <w:abstractNumId w:val="55"/>
   </w:num>
   <w:num w:numId="17" w16cid:durableId="1965962244">
-    <w:abstractNumId w:val="55"/>
+    <w:abstractNumId w:val="57"/>
   </w:num>
   <w:num w:numId="18" w16cid:durableId="857428966">
-    <w:abstractNumId w:val="57"/>
+    <w:abstractNumId w:val="59"/>
   </w:num>
   <w:num w:numId="19" w16cid:durableId="1102727235">
-    <w:abstractNumId w:val="81"/>
+    <w:abstractNumId w:val="83"/>
   </w:num>
   <w:num w:numId="20" w16cid:durableId="1825009635">
-    <w:abstractNumId w:val="56"/>
+    <w:abstractNumId w:val="58"/>
   </w:num>
   <w:num w:numId="21" w16cid:durableId="1057817951">
-    <w:abstractNumId w:val="59"/>
+    <w:abstractNumId w:val="61"/>
   </w:num>
   <w:num w:numId="22" w16cid:durableId="1840851271">
-    <w:abstractNumId w:val="75"/>
+    <w:abstractNumId w:val="77"/>
   </w:num>
   <w:num w:numId="23" w16cid:durableId="31004759">
     <w:abstractNumId w:val="4"/>
   </w:num>
   <w:num w:numId="24" w16cid:durableId="196084434">
-    <w:abstractNumId w:val="45"/>
+    <w:abstractNumId w:val="47"/>
   </w:num>
   <w:num w:numId="25" w16cid:durableId="1765566772">
-    <w:abstractNumId w:val="22"/>
+    <w:abstractNumId w:val="23"/>
   </w:num>
   <w:num w:numId="26" w16cid:durableId="2051343699">
     <w:abstractNumId w:val="18"/>
@@ -25109,13 +25470,13 @@
     <w:abstractNumId w:val="12"/>
   </w:num>
   <w:num w:numId="28" w16cid:durableId="1531380620">
-    <w:abstractNumId w:val="77"/>
+    <w:abstractNumId w:val="79"/>
   </w:num>
   <w:num w:numId="29" w16cid:durableId="557712069">
-    <w:abstractNumId w:val="76"/>
+    <w:abstractNumId w:val="78"/>
   </w:num>
   <w:num w:numId="30" w16cid:durableId="1426002138">
-    <w:abstractNumId w:val="62"/>
+    <w:abstractNumId w:val="64"/>
   </w:num>
   <w:num w:numId="31" w16cid:durableId="1782995960">
     <w:abstractNumId w:val="9"/>
@@ -25124,7 +25485,7 @@
     <w:abstractNumId w:val="0"/>
   </w:num>
   <w:num w:numId="33" w16cid:durableId="1618559931">
-    <w:abstractNumId w:val="68"/>
+    <w:abstractNumId w:val="70"/>
   </w:num>
   <w:num w:numId="34" w16cid:durableId="1400901532">
     <w:abstractNumId w:val="16"/>
@@ -25136,40 +25497,40 @@
     <w:abstractNumId w:val="8"/>
   </w:num>
   <w:num w:numId="37" w16cid:durableId="2038775239">
-    <w:abstractNumId w:val="25"/>
+    <w:abstractNumId w:val="26"/>
   </w:num>
   <w:num w:numId="38" w16cid:durableId="649556783">
-    <w:abstractNumId w:val="79"/>
+    <w:abstractNumId w:val="81"/>
   </w:num>
   <w:num w:numId="39" w16cid:durableId="1653750230">
-    <w:abstractNumId w:val="71"/>
+    <w:abstractNumId w:val="73"/>
   </w:num>
   <w:num w:numId="40" w16cid:durableId="938491575">
-    <w:abstractNumId w:val="60"/>
+    <w:abstractNumId w:val="62"/>
   </w:num>
   <w:num w:numId="41" w16cid:durableId="282228440">
-    <w:abstractNumId w:val="61"/>
+    <w:abstractNumId w:val="63"/>
   </w:num>
   <w:num w:numId="42" w16cid:durableId="1852640132">
-    <w:abstractNumId w:val="73"/>
+    <w:abstractNumId w:val="75"/>
   </w:num>
   <w:num w:numId="43" w16cid:durableId="1346899273">
     <w:abstractNumId w:val="13"/>
   </w:num>
   <w:num w:numId="44" w16cid:durableId="209463670">
-    <w:abstractNumId w:val="36"/>
+    <w:abstractNumId w:val="38"/>
   </w:num>
   <w:num w:numId="45" w16cid:durableId="1180044402">
-    <w:abstractNumId w:val="72"/>
+    <w:abstractNumId w:val="74"/>
   </w:num>
   <w:num w:numId="46" w16cid:durableId="581186852">
-    <w:abstractNumId w:val="50"/>
+    <w:abstractNumId w:val="52"/>
   </w:num>
   <w:num w:numId="47" w16cid:durableId="114033196">
-    <w:abstractNumId w:val="78"/>
+    <w:abstractNumId w:val="80"/>
   </w:num>
   <w:num w:numId="48" w16cid:durableId="1500274313">
-    <w:abstractNumId w:val="23"/>
+    <w:abstractNumId w:val="24"/>
   </w:num>
   <w:num w:numId="49" w16cid:durableId="1362121190">
     <w:abstractNumId w:val="17"/>
@@ -25178,106 +25539,112 @@
     <w:abstractNumId w:val="2"/>
   </w:num>
   <w:num w:numId="51" w16cid:durableId="71323068">
-    <w:abstractNumId w:val="44"/>
+    <w:abstractNumId w:val="46"/>
   </w:num>
   <w:num w:numId="52" w16cid:durableId="791824026">
     <w:abstractNumId w:val="11"/>
   </w:num>
   <w:num w:numId="53" w16cid:durableId="1858884855">
-    <w:abstractNumId w:val="27"/>
+    <w:abstractNumId w:val="28"/>
   </w:num>
   <w:num w:numId="54" w16cid:durableId="743839652">
     <w:abstractNumId w:val="14"/>
   </w:num>
   <w:num w:numId="55" w16cid:durableId="319189279">
-    <w:abstractNumId w:val="42"/>
+    <w:abstractNumId w:val="44"/>
   </w:num>
   <w:num w:numId="56" w16cid:durableId="1084959942">
-    <w:abstractNumId w:val="54"/>
+    <w:abstractNumId w:val="56"/>
   </w:num>
   <w:num w:numId="57" w16cid:durableId="551775919">
     <w:abstractNumId w:val="15"/>
   </w:num>
   <w:num w:numId="58" w16cid:durableId="449978646">
-    <w:abstractNumId w:val="24"/>
+    <w:abstractNumId w:val="25"/>
   </w:num>
   <w:num w:numId="59" w16cid:durableId="147091717">
-    <w:abstractNumId w:val="35"/>
+    <w:abstractNumId w:val="37"/>
   </w:num>
   <w:num w:numId="60" w16cid:durableId="83651720">
-    <w:abstractNumId w:val="28"/>
+    <w:abstractNumId w:val="29"/>
   </w:num>
   <w:num w:numId="61" w16cid:durableId="669069174">
+    <w:abstractNumId w:val="31"/>
+  </w:num>
+  <w:num w:numId="62" w16cid:durableId="1481843890">
+    <w:abstractNumId w:val="69"/>
+  </w:num>
+  <w:num w:numId="63" w16cid:durableId="410079372">
+    <w:abstractNumId w:val="39"/>
+  </w:num>
+  <w:num w:numId="64" w16cid:durableId="811677477">
+    <w:abstractNumId w:val="27"/>
+  </w:num>
+  <w:num w:numId="65" w16cid:durableId="817649347">
+    <w:abstractNumId w:val="42"/>
+  </w:num>
+  <w:num w:numId="66" w16cid:durableId="2128037891">
+    <w:abstractNumId w:val="50"/>
+  </w:num>
+  <w:num w:numId="67" w16cid:durableId="1726219145">
+    <w:abstractNumId w:val="82"/>
+  </w:num>
+  <w:num w:numId="68" w16cid:durableId="1766615434">
+    <w:abstractNumId w:val="68"/>
+  </w:num>
+  <w:num w:numId="69" w16cid:durableId="280234627">
     <w:abstractNumId w:val="30"/>
   </w:num>
-  <w:num w:numId="62" w16cid:durableId="1481843890">
-    <w:abstractNumId w:val="67"/>
-  </w:num>
-  <w:num w:numId="63" w16cid:durableId="410079372">
-    <w:abstractNumId w:val="37"/>
-  </w:num>
-  <w:num w:numId="64" w16cid:durableId="811677477">
-    <w:abstractNumId w:val="26"/>
-  </w:num>
-  <w:num w:numId="65" w16cid:durableId="817649347">
-    <w:abstractNumId w:val="40"/>
-  </w:num>
-  <w:num w:numId="66" w16cid:durableId="2128037891">
-    <w:abstractNumId w:val="48"/>
-  </w:num>
-  <w:num w:numId="67" w16cid:durableId="1726219145">
-    <w:abstractNumId w:val="80"/>
-  </w:num>
-  <w:num w:numId="68" w16cid:durableId="1766615434">
+  <w:num w:numId="70" w16cid:durableId="1207910607">
     <w:abstractNumId w:val="66"/>
-  </w:num>
-  <w:num w:numId="69" w16cid:durableId="280234627">
-    <w:abstractNumId w:val="29"/>
-  </w:num>
-  <w:num w:numId="70" w16cid:durableId="1207910607">
-    <w:abstractNumId w:val="64"/>
   </w:num>
   <w:num w:numId="71" w16cid:durableId="1640526067">
     <w:abstractNumId w:val="3"/>
   </w:num>
   <w:num w:numId="72" w16cid:durableId="1480685150">
-    <w:abstractNumId w:val="51"/>
+    <w:abstractNumId w:val="53"/>
   </w:num>
   <w:num w:numId="73" w16cid:durableId="1902905193">
-    <w:abstractNumId w:val="33"/>
+    <w:abstractNumId w:val="34"/>
   </w:num>
   <w:num w:numId="74" w16cid:durableId="1699814716">
-    <w:abstractNumId w:val="70"/>
+    <w:abstractNumId w:val="72"/>
   </w:num>
   <w:num w:numId="75" w16cid:durableId="1095246353">
     <w:abstractNumId w:val="20"/>
   </w:num>
   <w:num w:numId="76" w16cid:durableId="1478064906">
-    <w:abstractNumId w:val="65"/>
+    <w:abstractNumId w:val="67"/>
   </w:num>
   <w:num w:numId="77" w16cid:durableId="153382077">
     <w:abstractNumId w:val="6"/>
   </w:num>
   <w:num w:numId="78" w16cid:durableId="1038506737">
-    <w:abstractNumId w:val="32"/>
+    <w:abstractNumId w:val="33"/>
   </w:num>
   <w:num w:numId="79" w16cid:durableId="370769239">
-    <w:abstractNumId w:val="47"/>
+    <w:abstractNumId w:val="49"/>
   </w:num>
   <w:num w:numId="80" w16cid:durableId="1923443751">
-    <w:abstractNumId w:val="82"/>
+    <w:abstractNumId w:val="84"/>
   </w:num>
   <w:num w:numId="81" w16cid:durableId="1046220979">
-    <w:abstractNumId w:val="46"/>
+    <w:abstractNumId w:val="48"/>
   </w:num>
   <w:num w:numId="82" w16cid:durableId="1474832525">
-    <w:abstractNumId w:val="74"/>
+    <w:abstractNumId w:val="76"/>
   </w:num>
   <w:num w:numId="83" w16cid:durableId="1246305922">
     <w:abstractNumId w:val="19"/>
   </w:num>
   <w:num w:numId="84" w16cid:durableId="769273119">
-    <w:abstractNumId w:val="49"/>
+    <w:abstractNumId w:val="51"/>
+  </w:num>
+  <w:num w:numId="85" w16cid:durableId="1243024461">
+    <w:abstractNumId w:val="36"/>
+  </w:num>
+  <w:num w:numId="86" w16cid:durableId="1116098005">
+    <w:abstractNumId w:val="22"/>
   </w:num>
   <w:numIdMacAtCleanup w:val="82"/>
 </w:numbering>
@@ -25779,7 +26146,6 @@
   <w:style w:type="character" w:default="1" w:styleId="DefaultParagraphFont">
     <w:name w:val="Default Paragraph Font"/>
     <w:uiPriority w:val="1"/>
-    <w:semiHidden/>
     <w:unhideWhenUsed/>
   </w:style>
   <w:style w:type="table" w:default="1" w:styleId="TableNormal">

</xml_diff>

<commit_message>
Fix 'da_evt' DT norm and 'multiplicity_scale'.
</commit_message>
<xml_diff>
--- a/doc/Change log.docx
+++ b/doc/Change log.docx
@@ -58,7 +58,25 @@
         <w:rPr>
           <w:lang w:val="en-AU"/>
         </w:rPr>
-        <w:t>27 May, 2026 (branch “main”)</w:t>
+        <w:t>10</w:t>
+      </w:r>
+      <w:r>
+        <w:rPr>
+          <w:lang w:val="en-AU"/>
+        </w:rPr>
+        <w:t xml:space="preserve"> </w:t>
+      </w:r>
+      <w:r>
+        <w:rPr>
+          <w:lang w:val="en-AU"/>
+        </w:rPr>
+        <w:t>June</w:t>
+      </w:r>
+      <w:r>
+        <w:rPr>
+          <w:lang w:val="en-AU"/>
+        </w:rPr>
+        <w:t>, 2026 (branch “main”)</w:t>
       </w:r>
     </w:p>
     <w:p>
@@ -69,6 +87,427 @@
         </w:numPr>
       </w:pPr>
       <w:r>
+        <w:t>‘</w:t>
+      </w:r>
+      <w:proofErr w:type="spellStart"/>
+      <w:r>
+        <w:t>Dead_fraction</w:t>
+      </w:r>
+      <w:proofErr w:type="spellEnd"/>
+      <w:r>
+        <w:t>’ weighting issue in some devices</w:t>
+      </w:r>
+    </w:p>
+    <w:p>
+      <w:pPr>
+        <w:numPr>
+          <w:ilvl w:val="1"/>
+          <w:numId w:val="78"/>
+        </w:numPr>
+      </w:pPr>
+      <w:r>
+        <w:t>These devices implement ‘</w:t>
+      </w:r>
+      <w:proofErr w:type="spellStart"/>
+      <w:r>
+        <w:t>get_dead_weight</w:t>
+      </w:r>
+      <w:proofErr w:type="spellEnd"/>
+      <w:r>
+        <w:t>’ and ‘</w:t>
+      </w:r>
+      <w:proofErr w:type="spellStart"/>
+      <w:r>
+        <w:t>get_dead_weight_mode</w:t>
+      </w:r>
+      <w:proofErr w:type="spellEnd"/>
+      <w:r>
+        <w:t>’:</w:t>
+      </w:r>
+    </w:p>
+    <w:p>
+      <w:pPr>
+        <w:numPr>
+          <w:ilvl w:val="2"/>
+          <w:numId w:val="78"/>
+        </w:numPr>
+      </w:pPr>
+      <w:r>
+        <w:t xml:space="preserve">FalconX, </w:t>
+      </w:r>
+      <w:proofErr w:type="spellStart"/>
+      <w:r>
+        <w:t>Fastcom</w:t>
+      </w:r>
+      <w:proofErr w:type="spellEnd"/>
+      <w:r>
+        <w:t xml:space="preserve"> MPA4, </w:t>
+      </w:r>
+      <w:proofErr w:type="spellStart"/>
+      <w:r>
+        <w:t>iXRF</w:t>
+      </w:r>
+      <w:proofErr w:type="spellEnd"/>
+      <w:r>
+        <w:t>, Maia, MDAQ2.</w:t>
+      </w:r>
+    </w:p>
+    <w:p>
+      <w:pPr>
+        <w:numPr>
+          <w:ilvl w:val="2"/>
+          <w:numId w:val="78"/>
+        </w:numPr>
+      </w:pPr>
+      <w:r>
+        <w:t>These all set ‘mode’ in ‘</w:t>
+      </w:r>
+      <w:proofErr w:type="spellStart"/>
+      <w:r>
+        <w:t>da_evt</w:t>
+      </w:r>
+      <w:proofErr w:type="spellEnd"/>
+      <w:r>
+        <w:t>’ to 0,1,2.</w:t>
+      </w:r>
+    </w:p>
+    <w:p>
+      <w:pPr>
+        <w:numPr>
+          <w:ilvl w:val="2"/>
+          <w:numId w:val="78"/>
+        </w:numPr>
+      </w:pPr>
+      <w:r>
+        <w:t>These behave correctly.</w:t>
+      </w:r>
+    </w:p>
+    <w:p>
+      <w:pPr>
+        <w:numPr>
+          <w:ilvl w:val="1"/>
+          <w:numId w:val="78"/>
+        </w:numPr>
+      </w:pPr>
+      <w:r>
+        <w:t>Default ‘mode in ‘</w:t>
+      </w:r>
+      <w:proofErr w:type="spellStart"/>
+      <w:r>
+        <w:t>da_evt</w:t>
+      </w:r>
+      <w:proofErr w:type="spellEnd"/>
+      <w:r>
+        <w:t>’ set to -1</w:t>
+      </w:r>
+    </w:p>
+    <w:p>
+      <w:pPr>
+        <w:numPr>
+          <w:ilvl w:val="2"/>
+          <w:numId w:val="78"/>
+        </w:numPr>
+      </w:pPr>
+      <w:r>
+        <w:t>This causes ‘</w:t>
+      </w:r>
+      <w:proofErr w:type="spellStart"/>
+      <w:r>
+        <w:t>dead_fraction</w:t>
+      </w:r>
+      <w:proofErr w:type="spellEnd"/>
+      <w:r>
+        <w:t>’ to be scaled down by ‘dwell’, when dwell present.</w:t>
+      </w:r>
+    </w:p>
+    <w:p>
+      <w:pPr>
+        <w:numPr>
+          <w:ilvl w:val="1"/>
+          <w:numId w:val="78"/>
+        </w:numPr>
+      </w:pPr>
+      <w:r>
+        <w:t>Devices that implement ‘</w:t>
+      </w:r>
+      <w:proofErr w:type="spellStart"/>
+      <w:r>
+        <w:t>get_dwell</w:t>
+      </w:r>
+      <w:proofErr w:type="spellEnd"/>
+      <w:r>
+        <w:t>’:</w:t>
+      </w:r>
+    </w:p>
+    <w:p>
+      <w:pPr>
+        <w:numPr>
+          <w:ilvl w:val="2"/>
+          <w:numId w:val="78"/>
+        </w:numPr>
+      </w:pPr>
+      <w:r>
+        <w:t>AS MEX_H</w:t>
+      </w:r>
+      <w:r>
+        <w:t>5</w:t>
+      </w:r>
+      <w:r>
+        <w:t xml:space="preserve">, DAQ, FalconX, </w:t>
+      </w:r>
+      <w:proofErr w:type="spellStart"/>
+      <w:r>
+        <w:t>Fastcom</w:t>
+      </w:r>
+      <w:proofErr w:type="spellEnd"/>
+      <w:r>
+        <w:t xml:space="preserve"> MPA4, </w:t>
+      </w:r>
+      <w:proofErr w:type="spellStart"/>
+      <w:r>
+        <w:t>iXRF</w:t>
+      </w:r>
+      <w:proofErr w:type="spellEnd"/>
+      <w:r>
+        <w:t>, Maia, Mdaq2, Midas, NSLS MCA, NSLS XFM_H5, Petra_P06_H5, PNC_CAT HDF</w:t>
+      </w:r>
+    </w:p>
+    <w:p>
+      <w:pPr>
+        <w:numPr>
+          <w:ilvl w:val="1"/>
+          <w:numId w:val="78"/>
+        </w:numPr>
+      </w:pPr>
+      <w:r>
+        <w:t xml:space="preserve">Of these, these do </w:t>
+      </w:r>
+      <w:r>
+        <w:rPr>
+          <w:u w:val="single"/>
+        </w:rPr>
+        <w:t>not</w:t>
+      </w:r>
+      <w:r>
+        <w:t xml:space="preserve"> implement ‘</w:t>
+      </w:r>
+      <w:proofErr w:type="spellStart"/>
+      <w:r>
+        <w:t>get_dead_weight_mode</w:t>
+      </w:r>
+      <w:proofErr w:type="spellEnd"/>
+      <w:r>
+        <w:t>’ (so ‘mode’= -1)</w:t>
+      </w:r>
+    </w:p>
+    <w:p>
+      <w:pPr>
+        <w:numPr>
+          <w:ilvl w:val="2"/>
+          <w:numId w:val="78"/>
+        </w:numPr>
+      </w:pPr>
+      <w:r>
+        <w:t>AS MEX_H</w:t>
+      </w:r>
+      <w:r>
+        <w:t>5</w:t>
+      </w:r>
+      <w:r>
+        <w:t>, DAQ, Midas, NSLS MCA, NSLS XFM_H5, Petra_P06_H5, PNC_CAT HDF</w:t>
+      </w:r>
+    </w:p>
+    <w:p>
+      <w:pPr>
+        <w:numPr>
+          <w:ilvl w:val="1"/>
+          <w:numId w:val="78"/>
+        </w:numPr>
+      </w:pPr>
+      <w:r>
+        <w:t xml:space="preserve">Do any of these </w:t>
+      </w:r>
+      <w:r>
+        <w:rPr>
+          <w:u w:val="single"/>
+        </w:rPr>
+        <w:t>require</w:t>
+      </w:r>
+      <w:r>
+        <w:t xml:space="preserve"> returned ‘</w:t>
+      </w:r>
+      <w:proofErr w:type="spellStart"/>
+      <w:r>
+        <w:t>dead_fraction</w:t>
+      </w:r>
+      <w:proofErr w:type="spellEnd"/>
+      <w:r>
+        <w:t>’ to be divided by ‘dwell’? In other words, do they accumulate dead time into ‘</w:t>
+      </w:r>
+      <w:proofErr w:type="spellStart"/>
+      <w:r>
+        <w:t>dead_fraction</w:t>
+      </w:r>
+      <w:proofErr w:type="spellEnd"/>
+      <w:r>
+        <w:t>’ over event loop?</w:t>
+      </w:r>
+    </w:p>
+    <w:p>
+      <w:pPr>
+        <w:numPr>
+          <w:ilvl w:val="2"/>
+          <w:numId w:val="78"/>
+        </w:numPr>
+      </w:pPr>
+      <w:r>
+        <w:t>Yes: DAQ, Midas</w:t>
+      </w:r>
+    </w:p>
+    <w:p>
+      <w:pPr>
+        <w:numPr>
+          <w:ilvl w:val="2"/>
+          <w:numId w:val="78"/>
+        </w:numPr>
+      </w:pPr>
+      <w:r>
+        <w:t>No: NSLS MCA</w:t>
+      </w:r>
+    </w:p>
+    <w:p>
+      <w:pPr>
+        <w:numPr>
+          <w:ilvl w:val="2"/>
+          <w:numId w:val="78"/>
+        </w:numPr>
+      </w:pPr>
+      <w:r>
+        <w:t>Not sure: AS MEX_H</w:t>
+      </w:r>
+      <w:r>
+        <w:t>5</w:t>
+      </w:r>
+      <w:r>
+        <w:t>, NSLS XFM_H5, Petra_P06_H5, PNC_CAT HDF</w:t>
+      </w:r>
+    </w:p>
+    <w:p>
+      <w:pPr>
+        <w:numPr>
+          <w:ilvl w:val="3"/>
+          <w:numId w:val="78"/>
+        </w:numPr>
+      </w:pPr>
+      <w:r>
+        <w:t>Probably No. Dead-time is not implemented yet.</w:t>
+      </w:r>
+    </w:p>
+    <w:p>
+      <w:pPr>
+        <w:numPr>
+          <w:ilvl w:val="3"/>
+          <w:numId w:val="78"/>
+        </w:numPr>
+      </w:pPr>
+      <w:r>
+        <w:t xml:space="preserve">They should be implemented to return dead </w:t>
+      </w:r>
+      <w:r>
+        <w:rPr>
+          <w:u w:val="single"/>
+        </w:rPr>
+        <w:t>fraction</w:t>
+      </w:r>
+      <w:r>
+        <w:t>.</w:t>
+      </w:r>
+    </w:p>
+    <w:p>
+      <w:pPr>
+        <w:numPr>
+          <w:ilvl w:val="1"/>
+          <w:numId w:val="78"/>
+        </w:numPr>
+      </w:pPr>
+      <w:r>
+        <w:t>The “Yes” devices should implement:</w:t>
+      </w:r>
+    </w:p>
+    <w:p>
+      <w:pPr>
+        <w:numPr>
+          <w:ilvl w:val="2"/>
+          <w:numId w:val="78"/>
+        </w:numPr>
+      </w:pPr>
+      <w:r>
+        <w:t>‘</w:t>
+      </w:r>
+      <w:proofErr w:type="spellStart"/>
+      <w:r>
+        <w:t>get_dead_weight_mode</w:t>
+      </w:r>
+      <w:proofErr w:type="spellEnd"/>
+      <w:r>
+        <w:t>’ and return ‘mode’=0</w:t>
+      </w:r>
+    </w:p>
+    <w:p>
+      <w:pPr>
+        <w:numPr>
+          <w:ilvl w:val="2"/>
+          <w:numId w:val="78"/>
+        </w:numPr>
+      </w:pPr>
+      <w:r>
+        <w:t>‘</w:t>
+      </w:r>
+      <w:proofErr w:type="spellStart"/>
+      <w:r>
+        <w:t>get_dead_weight</w:t>
+      </w:r>
+      <w:proofErr w:type="spellEnd"/>
+      <w:r>
+        <w:t>’ and return weight = dwell map.</w:t>
+      </w:r>
+    </w:p>
+    <w:p>
+      <w:pPr>
+        <w:numPr>
+          <w:ilvl w:val="2"/>
+          <w:numId w:val="78"/>
+        </w:numPr>
+      </w:pPr>
+      <w:r>
+        <w:t>With this done, the default ‘mode’= -1 in ‘</w:t>
+      </w:r>
+      <w:proofErr w:type="spellStart"/>
+      <w:r>
+        <w:t>da_evt</w:t>
+      </w:r>
+      <w:proofErr w:type="spellEnd"/>
+      <w:r>
+        <w:t xml:space="preserve">’ should now </w:t>
+      </w:r>
+      <w:r>
+        <w:rPr>
+          <w:u w:val="single"/>
+        </w:rPr>
+        <w:t>not</w:t>
+      </w:r>
+      <w:r>
+        <w:t xml:space="preserve"> divide by dwell.</w:t>
+      </w:r>
+    </w:p>
+    <w:p>
+      <w:pPr>
+        <w:numPr>
+          <w:ilvl w:val="0"/>
+          <w:numId w:val="78"/>
+        </w:numPr>
+      </w:pPr>
+      <w:r>
         <w:t>Main GeoPIXE</w:t>
       </w:r>
     </w:p>
@@ -81,6 +520,255 @@
       </w:pPr>
       <w:proofErr w:type="spellStart"/>
       <w:r>
+        <w:t>multiplicity_scale</w:t>
+      </w:r>
+      <w:proofErr w:type="spellEnd"/>
+    </w:p>
+    <w:p>
+      <w:pPr>
+        <w:numPr>
+          <w:ilvl w:val="2"/>
+          <w:numId w:val="78"/>
+        </w:numPr>
+      </w:pPr>
+      <w:r>
+        <w:t xml:space="preserve">The default value for ‘multiplicity’ should be </w:t>
+      </w:r>
+      <w:proofErr w:type="spellStart"/>
+      <w:r>
+        <w:t>n_elements</w:t>
+      </w:r>
+      <w:proofErr w:type="spellEnd"/>
+      <w:r>
+        <w:t>(</w:t>
+      </w:r>
+      <w:proofErr w:type="spellStart"/>
+      <w:r>
+        <w:t>pactive</w:t>
+      </w:r>
+      <w:proofErr w:type="spellEnd"/>
+      <w:r>
+        <w:t>), if multiplicity is not passed in as a value</w:t>
+      </w:r>
+      <w:r>
+        <w:t>.</w:t>
+      </w:r>
+    </w:p>
+    <w:p>
+      <w:pPr>
+        <w:numPr>
+          <w:ilvl w:val="2"/>
+          <w:numId w:val="78"/>
+        </w:numPr>
+      </w:pPr>
+      <w:r>
+        <w:t>Tagged line with “@6-26”</w:t>
+      </w:r>
+    </w:p>
+    <w:p>
+      <w:pPr>
+        <w:numPr>
+          <w:ilvl w:val="1"/>
+          <w:numId w:val="78"/>
+        </w:numPr>
+      </w:pPr>
+      <w:proofErr w:type="spellStart"/>
+      <w:r>
+        <w:t>Da_evt</w:t>
+      </w:r>
+      <w:proofErr w:type="spellEnd"/>
+    </w:p>
+    <w:p>
+      <w:pPr>
+        <w:numPr>
+          <w:ilvl w:val="2"/>
+          <w:numId w:val="78"/>
+        </w:numPr>
+      </w:pPr>
+      <w:r>
+        <w:t>Remove divide by dwell map for ‘mode’= -1 case.</w:t>
+      </w:r>
+    </w:p>
+    <w:p>
+      <w:pPr>
+        <w:numPr>
+          <w:ilvl w:val="2"/>
+          <w:numId w:val="78"/>
+        </w:numPr>
+      </w:pPr>
+      <w:r>
+        <w:t>Need to fix affected devices: DAQ, Midas.</w:t>
+      </w:r>
+    </w:p>
+    <w:p>
+      <w:pPr>
+        <w:numPr>
+          <w:ilvl w:val="2"/>
+          <w:numId w:val="78"/>
+        </w:numPr>
+      </w:pPr>
+      <w:r>
+        <w:t>Tagged line with “@6-26”</w:t>
+      </w:r>
+    </w:p>
+    <w:p>
+      <w:pPr>
+        <w:numPr>
+          <w:ilvl w:val="1"/>
+          <w:numId w:val="78"/>
+        </w:numPr>
+      </w:pPr>
+      <w:r>
+        <w:t>Version 9.0</w:t>
+      </w:r>
+      <w:r>
+        <w:t>b</w:t>
+      </w:r>
+    </w:p>
+    <w:p>
+      <w:pPr>
+        <w:numPr>
+          <w:ilvl w:val="0"/>
+          <w:numId w:val="78"/>
+        </w:numPr>
+      </w:pPr>
+      <w:r>
+        <w:t>DAQ device object</w:t>
+      </w:r>
+    </w:p>
+    <w:p>
+      <w:pPr>
+        <w:numPr>
+          <w:ilvl w:val="1"/>
+          <w:numId w:val="78"/>
+        </w:numPr>
+      </w:pPr>
+      <w:r>
+        <w:t xml:space="preserve">Add methods: </w:t>
+      </w:r>
+      <w:r>
+        <w:t>‘</w:t>
+      </w:r>
+      <w:proofErr w:type="spellStart"/>
+      <w:r>
+        <w:t>get_dead_weight_mode</w:t>
+      </w:r>
+      <w:proofErr w:type="spellEnd"/>
+      <w:r>
+        <w:t>’ and return ‘mode’=0</w:t>
+      </w:r>
+      <w:r>
+        <w:t xml:space="preserve"> and </w:t>
+      </w:r>
+      <w:r>
+        <w:t>‘</w:t>
+      </w:r>
+      <w:proofErr w:type="spellStart"/>
+      <w:r>
+        <w:t>get_dead_weight</w:t>
+      </w:r>
+      <w:proofErr w:type="spellEnd"/>
+      <w:r>
+        <w:t>’ and return weight = dwell map.</w:t>
+      </w:r>
+    </w:p>
+    <w:p>
+      <w:pPr>
+        <w:numPr>
+          <w:ilvl w:val="1"/>
+          <w:numId w:val="78"/>
+        </w:numPr>
+      </w:pPr>
+      <w:r>
+        <w:t>Tagged line with “@6-26”</w:t>
+      </w:r>
+    </w:p>
+    <w:p>
+      <w:pPr>
+        <w:numPr>
+          <w:ilvl w:val="0"/>
+          <w:numId w:val="78"/>
+        </w:numPr>
+      </w:pPr>
+      <w:r>
+        <w:t>Midas</w:t>
+      </w:r>
+      <w:r>
+        <w:t xml:space="preserve"> device object</w:t>
+      </w:r>
+    </w:p>
+    <w:p>
+      <w:pPr>
+        <w:numPr>
+          <w:ilvl w:val="1"/>
+          <w:numId w:val="78"/>
+        </w:numPr>
+      </w:pPr>
+      <w:r>
+        <w:t>Add methods: ‘</w:t>
+      </w:r>
+      <w:proofErr w:type="spellStart"/>
+      <w:r>
+        <w:t>get_dead_weight_mode</w:t>
+      </w:r>
+      <w:proofErr w:type="spellEnd"/>
+      <w:r>
+        <w:t>’ and return ‘mode’=0 and ‘</w:t>
+      </w:r>
+      <w:proofErr w:type="spellStart"/>
+      <w:r>
+        <w:t>get_dead_weight</w:t>
+      </w:r>
+      <w:proofErr w:type="spellEnd"/>
+      <w:r>
+        <w:t>’ and return weight = dwell map.</w:t>
+      </w:r>
+    </w:p>
+    <w:p>
+      <w:pPr>
+        <w:numPr>
+          <w:ilvl w:val="1"/>
+          <w:numId w:val="78"/>
+        </w:numPr>
+      </w:pPr>
+      <w:r>
+        <w:t>Tagged line with “@6-26”</w:t>
+      </w:r>
+    </w:p>
+    <w:p>
+      <w:pPr>
+        <w:pStyle w:val="Heading3"/>
+        <w:rPr>
+          <w:lang w:val="en-AU"/>
+        </w:rPr>
+      </w:pPr>
+      <w:r>
+        <w:rPr>
+          <w:lang w:val="en-AU"/>
+        </w:rPr>
+        <w:t>27 May, 2026 (branch “main”)</w:t>
+      </w:r>
+    </w:p>
+    <w:p>
+      <w:pPr>
+        <w:numPr>
+          <w:ilvl w:val="0"/>
+          <w:numId w:val="87"/>
+        </w:numPr>
+      </w:pPr>
+      <w:r>
+        <w:t>Main GeoPIXE</w:t>
+      </w:r>
+    </w:p>
+    <w:p>
+      <w:pPr>
+        <w:numPr>
+          <w:ilvl w:val="1"/>
+          <w:numId w:val="87"/>
+        </w:numPr>
+      </w:pPr>
+      <w:proofErr w:type="spellStart"/>
+      <w:r>
         <w:t>Evt</w:t>
       </w:r>
       <w:proofErr w:type="spellEnd"/>
@@ -89,10 +777,11 @@
       <w:pPr>
         <w:numPr>
           <w:ilvl w:val="2"/>
-          <w:numId w:val="78"/>
-        </w:numPr>
-      </w:pPr>
-      <w:r>
+          <w:numId w:val="87"/>
+        </w:numPr>
+      </w:pPr>
+      <w:r>
+        <w:lastRenderedPageBreak/>
         <w:t>Use new ‘</w:t>
       </w:r>
       <w:proofErr w:type="spellStart"/>
@@ -130,7 +819,7 @@
       <w:pPr>
         <w:numPr>
           <w:ilvl w:val="1"/>
-          <w:numId w:val="78"/>
+          <w:numId w:val="87"/>
         </w:numPr>
       </w:pPr>
       <w:proofErr w:type="spellStart"/>
@@ -143,7 +832,7 @@
       <w:pPr>
         <w:numPr>
           <w:ilvl w:val="2"/>
-          <w:numId w:val="78"/>
+          <w:numId w:val="87"/>
         </w:numPr>
       </w:pPr>
       <w:r>
@@ -154,7 +843,7 @@
       <w:pPr>
         <w:numPr>
           <w:ilvl w:val="1"/>
-          <w:numId w:val="78"/>
+          <w:numId w:val="87"/>
         </w:numPr>
       </w:pPr>
       <w:proofErr w:type="spellStart"/>
@@ -167,7 +856,7 @@
       <w:pPr>
         <w:numPr>
           <w:ilvl w:val="2"/>
-          <w:numId w:val="78"/>
+          <w:numId w:val="87"/>
         </w:numPr>
       </w:pPr>
       <w:r>
@@ -178,7 +867,7 @@
       <w:pPr>
         <w:numPr>
           <w:ilvl w:val="1"/>
-          <w:numId w:val="78"/>
+          <w:numId w:val="87"/>
         </w:numPr>
       </w:pPr>
       <w:proofErr w:type="spellStart"/>
@@ -191,7 +880,7 @@
       <w:pPr>
         <w:numPr>
           <w:ilvl w:val="2"/>
-          <w:numId w:val="78"/>
+          <w:numId w:val="87"/>
         </w:numPr>
       </w:pPr>
       <w:r>
@@ -210,7 +899,7 @@
       <w:pPr>
         <w:numPr>
           <w:ilvl w:val="1"/>
-          <w:numId w:val="78"/>
+          <w:numId w:val="87"/>
         </w:numPr>
       </w:pPr>
       <w:proofErr w:type="spellStart"/>
@@ -223,7 +912,7 @@
       <w:pPr>
         <w:numPr>
           <w:ilvl w:val="2"/>
-          <w:numId w:val="78"/>
+          <w:numId w:val="87"/>
         </w:numPr>
       </w:pPr>
       <w:r>
@@ -250,7 +939,7 @@
       <w:pPr>
         <w:numPr>
           <w:ilvl w:val="2"/>
-          <w:numId w:val="78"/>
+          <w:numId w:val="87"/>
         </w:numPr>
       </w:pPr>
       <w:r>
@@ -277,7 +966,7 @@
       <w:pPr>
         <w:numPr>
           <w:ilvl w:val="1"/>
-          <w:numId w:val="78"/>
+          <w:numId w:val="87"/>
         </w:numPr>
       </w:pPr>
       <w:r>
@@ -828,7 +1517,6 @@
           <w:bCs/>
           <w:highlight w:val="yellow"/>
         </w:rPr>
-        <w:lastRenderedPageBreak/>
         <w:t>Log file option danger</w:t>
       </w:r>
       <w:r>
@@ -967,6 +1655,7 @@
         </w:numPr>
       </w:pPr>
       <w:r>
+        <w:lastRenderedPageBreak/>
         <w:t>Remember that</w:t>
       </w:r>
       <w:r>
@@ -1741,164 +2430,164 @@
         </w:numPr>
       </w:pPr>
       <w:r>
+        <w:t>Responds to a Notify, ‘spectrum-load’ to load a SPEC file.</w:t>
+      </w:r>
+    </w:p>
+    <w:p>
+      <w:pPr>
+        <w:numPr>
+          <w:ilvl w:val="1"/>
+          <w:numId w:val="83"/>
+        </w:numPr>
+      </w:pPr>
+      <w:proofErr w:type="spellStart"/>
+      <w:r>
+        <w:t>Spectrum_load</w:t>
+      </w:r>
+      <w:proofErr w:type="spellEnd"/>
+    </w:p>
+    <w:p>
+      <w:pPr>
+        <w:numPr>
+          <w:ilvl w:val="2"/>
+          <w:numId w:val="83"/>
+        </w:numPr>
+      </w:pPr>
+      <w:r>
+        <w:t>Can pass a filename ‘F1’ now.</w:t>
+      </w:r>
+    </w:p>
+    <w:p>
+      <w:pPr>
+        <w:numPr>
+          <w:ilvl w:val="1"/>
+          <w:numId w:val="83"/>
+        </w:numPr>
+      </w:pPr>
+      <w:proofErr w:type="spellStart"/>
+      <w:r>
+        <w:t>Spec</w:t>
+      </w:r>
+      <w:r>
+        <w:t>trum</w:t>
+      </w:r>
+      <w:r>
+        <w:t>_load_prep</w:t>
+      </w:r>
+      <w:proofErr w:type="spellEnd"/>
+    </w:p>
+    <w:p>
+      <w:pPr>
+        <w:numPr>
+          <w:ilvl w:val="2"/>
+          <w:numId w:val="83"/>
+        </w:numPr>
+      </w:pPr>
+      <w:r>
+        <w:t>If passed ‘F’ is present, use this</w:t>
+      </w:r>
+      <w:r>
+        <w:t xml:space="preserve"> and /</w:t>
+      </w:r>
+      <w:proofErr w:type="spellStart"/>
+      <w:r>
+        <w:t>skip_if_exists</w:t>
+      </w:r>
+      <w:proofErr w:type="spellEnd"/>
+      <w:r>
+        <w:t xml:space="preserve"> in ‘</w:t>
+      </w:r>
+      <w:proofErr w:type="spellStart"/>
+      <w:r>
+        <w:t>file_requester</w:t>
+      </w:r>
+      <w:proofErr w:type="spellEnd"/>
+      <w:r>
+        <w:t>’.</w:t>
+      </w:r>
+    </w:p>
+    <w:p>
+      <w:pPr>
+        <w:numPr>
+          <w:ilvl w:val="1"/>
+          <w:numId w:val="83"/>
+        </w:numPr>
+      </w:pPr>
+      <w:proofErr w:type="spellStart"/>
+      <w:r>
+        <w:t>Fit_setup</w:t>
+      </w:r>
+      <w:proofErr w:type="spellEnd"/>
+    </w:p>
+    <w:p>
+      <w:pPr>
+        <w:numPr>
+          <w:ilvl w:val="2"/>
+          <w:numId w:val="83"/>
+        </w:numPr>
+      </w:pPr>
+      <w:r>
+        <w:t xml:space="preserve">Register this for new </w:t>
+      </w:r>
+      <w:proofErr w:type="spellStart"/>
+      <w:r>
+        <w:t>Notifys</w:t>
+      </w:r>
+      <w:proofErr w:type="spellEnd"/>
+      <w:r>
+        <w:t>: “</w:t>
+      </w:r>
+      <w:r>
+        <w:t>fit-setup-load</w:t>
+      </w:r>
+      <w:r>
+        <w:t>” to load a PCM file.</w:t>
+      </w:r>
+    </w:p>
+    <w:p>
+      <w:pPr>
+        <w:numPr>
+          <w:ilvl w:val="2"/>
+          <w:numId w:val="83"/>
+        </w:numPr>
+      </w:pPr>
+      <w:r>
+        <w:t>Responds to a Notify, ‘fit-setup-load’ to load a PCM.</w:t>
+      </w:r>
+    </w:p>
+    <w:p>
+      <w:pPr>
+        <w:numPr>
+          <w:ilvl w:val="2"/>
+          <w:numId w:val="83"/>
+        </w:numPr>
+      </w:pPr>
+      <w:r>
+        <w:t>After a DA save, it will advise to also save PCM with same name.</w:t>
+      </w:r>
+    </w:p>
+    <w:p>
+      <w:pPr>
+        <w:numPr>
+          <w:ilvl w:val="1"/>
+          <w:numId w:val="83"/>
+        </w:numPr>
+      </w:pPr>
+      <w:proofErr w:type="spellStart"/>
+      <w:r>
+        <w:t>Layer_setup</w:t>
+      </w:r>
+      <w:proofErr w:type="spellEnd"/>
+    </w:p>
+    <w:p>
+      <w:pPr>
+        <w:numPr>
+          <w:ilvl w:val="2"/>
+          <w:numId w:val="83"/>
+        </w:numPr>
+      </w:pPr>
+      <w:r>
         <w:lastRenderedPageBreak/>
-        <w:t>Responds to a Notify, ‘spectrum-load’ to load a SPEC file.</w:t>
-      </w:r>
-    </w:p>
-    <w:p>
-      <w:pPr>
-        <w:numPr>
-          <w:ilvl w:val="1"/>
-          <w:numId w:val="83"/>
-        </w:numPr>
-      </w:pPr>
-      <w:proofErr w:type="spellStart"/>
-      <w:r>
-        <w:t>Spectrum_load</w:t>
-      </w:r>
-      <w:proofErr w:type="spellEnd"/>
-    </w:p>
-    <w:p>
-      <w:pPr>
-        <w:numPr>
-          <w:ilvl w:val="2"/>
-          <w:numId w:val="83"/>
-        </w:numPr>
-      </w:pPr>
-      <w:r>
-        <w:t>Can pass a filename ‘F1’ now.</w:t>
-      </w:r>
-    </w:p>
-    <w:p>
-      <w:pPr>
-        <w:numPr>
-          <w:ilvl w:val="1"/>
-          <w:numId w:val="83"/>
-        </w:numPr>
-      </w:pPr>
-      <w:proofErr w:type="spellStart"/>
-      <w:r>
-        <w:t>Spec</w:t>
-      </w:r>
-      <w:r>
-        <w:t>trum</w:t>
-      </w:r>
-      <w:r>
-        <w:t>_load_prep</w:t>
-      </w:r>
-      <w:proofErr w:type="spellEnd"/>
-    </w:p>
-    <w:p>
-      <w:pPr>
-        <w:numPr>
-          <w:ilvl w:val="2"/>
-          <w:numId w:val="83"/>
-        </w:numPr>
-      </w:pPr>
-      <w:r>
-        <w:t>If passed ‘F’ is present, use this</w:t>
-      </w:r>
-      <w:r>
-        <w:t xml:space="preserve"> and /</w:t>
-      </w:r>
-      <w:proofErr w:type="spellStart"/>
-      <w:r>
-        <w:t>skip_if_exists</w:t>
-      </w:r>
-      <w:proofErr w:type="spellEnd"/>
-      <w:r>
-        <w:t xml:space="preserve"> in ‘</w:t>
-      </w:r>
-      <w:proofErr w:type="spellStart"/>
-      <w:r>
-        <w:t>file_requester</w:t>
-      </w:r>
-      <w:proofErr w:type="spellEnd"/>
-      <w:r>
-        <w:t>’.</w:t>
-      </w:r>
-    </w:p>
-    <w:p>
-      <w:pPr>
-        <w:numPr>
-          <w:ilvl w:val="1"/>
-          <w:numId w:val="83"/>
-        </w:numPr>
-      </w:pPr>
-      <w:proofErr w:type="spellStart"/>
-      <w:r>
-        <w:t>Fit_setup</w:t>
-      </w:r>
-      <w:proofErr w:type="spellEnd"/>
-    </w:p>
-    <w:p>
-      <w:pPr>
-        <w:numPr>
-          <w:ilvl w:val="2"/>
-          <w:numId w:val="83"/>
-        </w:numPr>
-      </w:pPr>
-      <w:r>
-        <w:t xml:space="preserve">Register this for new </w:t>
-      </w:r>
-      <w:proofErr w:type="spellStart"/>
-      <w:r>
-        <w:t>Notifys</w:t>
-      </w:r>
-      <w:proofErr w:type="spellEnd"/>
-      <w:r>
-        <w:t>: “</w:t>
-      </w:r>
-      <w:r>
-        <w:t>fit-setup-load</w:t>
-      </w:r>
-      <w:r>
-        <w:t>” to load a PCM file.</w:t>
-      </w:r>
-    </w:p>
-    <w:p>
-      <w:pPr>
-        <w:numPr>
-          <w:ilvl w:val="2"/>
-          <w:numId w:val="83"/>
-        </w:numPr>
-      </w:pPr>
-      <w:r>
-        <w:t>Responds to a Notify, ‘fit-setup-load’ to load a PCM.</w:t>
-      </w:r>
-    </w:p>
-    <w:p>
-      <w:pPr>
-        <w:numPr>
-          <w:ilvl w:val="2"/>
-          <w:numId w:val="83"/>
-        </w:numPr>
-      </w:pPr>
-      <w:r>
-        <w:t>After a DA save, it will advise to also save PCM with same name.</w:t>
-      </w:r>
-    </w:p>
-    <w:p>
-      <w:pPr>
-        <w:numPr>
-          <w:ilvl w:val="1"/>
-          <w:numId w:val="83"/>
-        </w:numPr>
-      </w:pPr>
-      <w:proofErr w:type="spellStart"/>
-      <w:r>
-        <w:t>Layer_setup</w:t>
-      </w:r>
-      <w:proofErr w:type="spellEnd"/>
-    </w:p>
-    <w:p>
-      <w:pPr>
-        <w:numPr>
-          <w:ilvl w:val="2"/>
-          <w:numId w:val="83"/>
-        </w:numPr>
-      </w:pPr>
-      <w:r>
         <w:t>After a YIELD save, it will advise to also save LCM with same name.</w:t>
       </w:r>
     </w:p>
@@ -2614,7 +3303,6 @@
         <w:rPr>
           <w:lang w:val="en-AU"/>
         </w:rPr>
-        <w:lastRenderedPageBreak/>
         <w:t>8 Apr</w:t>
       </w:r>
       <w:r>
@@ -2739,6 +3427,7 @@
         </w:numPr>
       </w:pPr>
       <w:r>
+        <w:lastRenderedPageBreak/>
         <w:t>Main GeoPIXE</w:t>
       </w:r>
     </w:p>
@@ -3641,7 +4330,6 @@
         </w:numPr>
       </w:pPr>
       <w:r>
-        <w:lastRenderedPageBreak/>
         <w:t>Replace all ‘</w:t>
       </w:r>
       <w:proofErr w:type="spellStart"/>
@@ -3772,6 +4460,7 @@
         </w:numPr>
       </w:pPr>
       <w:r>
+        <w:lastRenderedPageBreak/>
         <w:t>Version, 8.9r</w:t>
       </w:r>
     </w:p>
@@ -4635,7 +5324,6 @@
         </w:numPr>
       </w:pPr>
       <w:r>
-        <w:lastRenderedPageBreak/>
         <w:t>New function to return relative graphics scaling for widgets if system font change effects widget sizes. See ‘</w:t>
       </w:r>
       <w:proofErr w:type="spellStart"/>
@@ -4748,6 +5436,7 @@
         </w:numPr>
       </w:pPr>
       <w:r>
+        <w:lastRenderedPageBreak/>
         <w:t>A new parameter ‘</w:t>
       </w:r>
       <w:proofErr w:type="spellStart"/>
@@ -5279,7 +5968,6 @@
         <w:rPr>
           <w:lang w:val="en-AU"/>
         </w:rPr>
-        <w:lastRenderedPageBreak/>
         <w:t>10 Mar</w:t>
       </w:r>
       <w:r>
@@ -5476,6 +6164,7 @@
         </w:numPr>
       </w:pPr>
       <w:r>
+        <w:lastRenderedPageBreak/>
         <w:t>Version, 8.9</w:t>
       </w:r>
       <w:r>
@@ -5879,7 +6568,6 @@
         </w:numPr>
       </w:pPr>
       <w:r>
-        <w:lastRenderedPageBreak/>
         <w:t>New menu “Analyze</w:t>
       </w:r>
       <w:r>
@@ -6032,6 +6720,7 @@
       </w:pPr>
       <w:proofErr w:type="spellStart"/>
       <w:r>
+        <w:lastRenderedPageBreak/>
         <w:t>wizard_standards_callback_image_done</w:t>
       </w:r>
       <w:proofErr w:type="spellEnd"/>
@@ -6740,7 +7429,6 @@
         <w:rPr>
           <w:lang w:val="en-AU"/>
         </w:rPr>
-        <w:lastRenderedPageBreak/>
         <w:t>9</w:t>
       </w:r>
       <w:r>
@@ -6881,6 +7569,7 @@
         </w:numPr>
       </w:pPr>
       <w:r>
+        <w:lastRenderedPageBreak/>
         <w:t>New embedded HTML browser in GeoPIXE to display help docs.</w:t>
       </w:r>
       <w:r>
@@ -7433,113 +8122,113 @@
         </w:numPr>
       </w:pPr>
       <w:r>
+        <w:t xml:space="preserve">Take care using </w:t>
+      </w:r>
+      <w:proofErr w:type="spellStart"/>
+      <w:r>
+        <w:t>detector_update</w:t>
+      </w:r>
+      <w:proofErr w:type="spellEnd"/>
+      <w:r>
+        <w:t>, as it may return a different list order each call. Only use the returned lists initially</w:t>
+      </w:r>
+      <w:r>
+        <w:t xml:space="preserve"> to make droplist</w:t>
+      </w:r>
+      <w:r>
+        <w:t>.</w:t>
+      </w:r>
+      <w:r>
+        <w:t xml:space="preserve"> Use it after that just to find the matching filename.</w:t>
+      </w:r>
+    </w:p>
+    <w:p>
+      <w:pPr>
+        <w:numPr>
+          <w:ilvl w:val="1"/>
+          <w:numId w:val="65"/>
+        </w:numPr>
+      </w:pPr>
+      <w:proofErr w:type="spellStart"/>
+      <w:r>
+        <w:t>Plot_maia_parameter</w:t>
+      </w:r>
+      <w:proofErr w:type="spellEnd"/>
+    </w:p>
+    <w:p>
+      <w:pPr>
+        <w:numPr>
+          <w:ilvl w:val="2"/>
+          <w:numId w:val="65"/>
+        </w:numPr>
+      </w:pPr>
+      <w:r>
+        <w:t>If /</w:t>
+      </w:r>
+      <w:proofErr w:type="spellStart"/>
+      <w:r>
+        <w:t>wset_done</w:t>
+      </w:r>
+      <w:proofErr w:type="spellEnd"/>
+      <w:r>
+        <w:t xml:space="preserve"> then adjust plot region.</w:t>
+      </w:r>
+    </w:p>
+    <w:p>
+      <w:pPr>
+        <w:numPr>
+          <w:ilvl w:val="2"/>
+          <w:numId w:val="65"/>
+        </w:numPr>
+      </w:pPr>
+      <w:r>
+        <w:t xml:space="preserve">Only load colour maps, etc. if </w:t>
+      </w:r>
+      <w:proofErr w:type="spellStart"/>
+      <w:r>
+        <w:t>west_done</w:t>
+      </w:r>
+      <w:proofErr w:type="spellEnd"/>
+      <w:r>
+        <w:t xml:space="preserve"> false.</w:t>
+      </w:r>
+    </w:p>
+    <w:p>
+      <w:pPr>
+        <w:numPr>
+          <w:ilvl w:val="1"/>
+          <w:numId w:val="65"/>
+        </w:numPr>
+      </w:pPr>
+      <w:proofErr w:type="spellStart"/>
+      <w:r>
+        <w:t>Detector_setup</w:t>
+      </w:r>
+      <w:proofErr w:type="spellEnd"/>
+    </w:p>
+    <w:p>
+      <w:pPr>
+        <w:numPr>
+          <w:ilvl w:val="2"/>
+          <w:numId w:val="65"/>
+        </w:numPr>
+      </w:pPr>
+      <w:r>
+        <w:t>Fixed plot colours, which may get mixed up by other windows.</w:t>
+      </w:r>
+    </w:p>
+    <w:p>
+      <w:pPr>
+        <w:pStyle w:val="Heading3"/>
+        <w:rPr>
+          <w:lang w:val="en-AU"/>
+        </w:rPr>
+      </w:pPr>
+      <w:r>
+        <w:rPr>
+          <w:lang w:val="en-AU"/>
+        </w:rPr>
         <w:lastRenderedPageBreak/>
-        <w:t xml:space="preserve">Take care using </w:t>
-      </w:r>
-      <w:proofErr w:type="spellStart"/>
-      <w:r>
-        <w:t>detector_update</w:t>
-      </w:r>
-      <w:proofErr w:type="spellEnd"/>
-      <w:r>
-        <w:t>, as it may return a different list order each call. Only use the returned lists initially</w:t>
-      </w:r>
-      <w:r>
-        <w:t xml:space="preserve"> to make droplist</w:t>
-      </w:r>
-      <w:r>
-        <w:t>.</w:t>
-      </w:r>
-      <w:r>
-        <w:t xml:space="preserve"> Use it after that just to find the matching filename.</w:t>
-      </w:r>
-    </w:p>
-    <w:p>
-      <w:pPr>
-        <w:numPr>
-          <w:ilvl w:val="1"/>
-          <w:numId w:val="65"/>
-        </w:numPr>
-      </w:pPr>
-      <w:proofErr w:type="spellStart"/>
-      <w:r>
-        <w:t>Plot_maia_parameter</w:t>
-      </w:r>
-      <w:proofErr w:type="spellEnd"/>
-    </w:p>
-    <w:p>
-      <w:pPr>
-        <w:numPr>
-          <w:ilvl w:val="2"/>
-          <w:numId w:val="65"/>
-        </w:numPr>
-      </w:pPr>
-      <w:r>
-        <w:t>If /</w:t>
-      </w:r>
-      <w:proofErr w:type="spellStart"/>
-      <w:r>
-        <w:t>wset_done</w:t>
-      </w:r>
-      <w:proofErr w:type="spellEnd"/>
-      <w:r>
-        <w:t xml:space="preserve"> then adjust plot region.</w:t>
-      </w:r>
-    </w:p>
-    <w:p>
-      <w:pPr>
-        <w:numPr>
-          <w:ilvl w:val="2"/>
-          <w:numId w:val="65"/>
-        </w:numPr>
-      </w:pPr>
-      <w:r>
-        <w:t xml:space="preserve">Only load colour maps, etc. if </w:t>
-      </w:r>
-      <w:proofErr w:type="spellStart"/>
-      <w:r>
-        <w:t>west_done</w:t>
-      </w:r>
-      <w:proofErr w:type="spellEnd"/>
-      <w:r>
-        <w:t xml:space="preserve"> false.</w:t>
-      </w:r>
-    </w:p>
-    <w:p>
-      <w:pPr>
-        <w:numPr>
-          <w:ilvl w:val="1"/>
-          <w:numId w:val="65"/>
-        </w:numPr>
-      </w:pPr>
-      <w:proofErr w:type="spellStart"/>
-      <w:r>
-        <w:t>Detector_setup</w:t>
-      </w:r>
-      <w:proofErr w:type="spellEnd"/>
-    </w:p>
-    <w:p>
-      <w:pPr>
-        <w:numPr>
-          <w:ilvl w:val="2"/>
-          <w:numId w:val="65"/>
-        </w:numPr>
-      </w:pPr>
-      <w:r>
-        <w:t>Fixed plot colours, which may get mixed up by other windows.</w:t>
-      </w:r>
-    </w:p>
-    <w:p>
-      <w:pPr>
-        <w:pStyle w:val="Heading3"/>
-        <w:rPr>
-          <w:lang w:val="en-AU"/>
-        </w:rPr>
-      </w:pPr>
-      <w:r>
-        <w:rPr>
-          <w:lang w:val="en-AU"/>
-        </w:rPr>
         <w:t>20</w:t>
       </w:r>
       <w:r>
@@ -8274,7 +8963,6 @@
         </w:numPr>
       </w:pPr>
       <w:r>
-        <w:lastRenderedPageBreak/>
         <w:t xml:space="preserve">Move these Register Notify to the main </w:t>
       </w:r>
       <w:r>
@@ -8418,6 +9106,7 @@
         <w:rPr>
           <w:lang w:val="en-AU"/>
         </w:rPr>
+        <w:lastRenderedPageBreak/>
         <w:t>28</w:t>
       </w:r>
       <w:r>
@@ -9020,7 +9709,6 @@
         </w:numPr>
       </w:pPr>
       <w:r>
-        <w:lastRenderedPageBreak/>
         <w:t xml:space="preserve">Add extra condition for setting /numeric on </w:t>
       </w:r>
       <w:proofErr w:type="spellStart"/>
@@ -9214,6 +9902,7 @@
       </w:pPr>
       <w:proofErr w:type="spellStart"/>
       <w:r>
+        <w:lastRenderedPageBreak/>
         <w:t>Scan_dir_evt</w:t>
       </w:r>
       <w:proofErr w:type="spellEnd"/>
@@ -9867,7 +10556,6 @@
         </w:numPr>
       </w:pPr>
       <w:r>
-        <w:lastRenderedPageBreak/>
         <w:t>Only in the Timer event code are these popped up as Warnings, and message cleared, before the Timer is restarted, to avoid timer overrun.</w:t>
       </w:r>
     </w:p>
@@ -9991,6 +10679,7 @@
       </w:pPr>
       <w:proofErr w:type="spellStart"/>
       <w:r>
+        <w:lastRenderedPageBreak/>
         <w:t>Wizard_window_count</w:t>
       </w:r>
       <w:proofErr w:type="spellEnd"/>
@@ -10487,7 +11176,6 @@
       </w:pPr>
       <w:proofErr w:type="spellStart"/>
       <w:r>
-        <w:lastRenderedPageBreak/>
         <w:t>ImageEventcb</w:t>
       </w:r>
       <w:proofErr w:type="spellEnd"/>
@@ -10626,6 +11314,7 @@
         <w:rPr>
           <w:lang w:val="en-AU"/>
         </w:rPr>
+        <w:lastRenderedPageBreak/>
         <w:t>8</w:t>
       </w:r>
       <w:r>
@@ -11128,170 +11817,170 @@
       </w:pPr>
       <w:proofErr w:type="spellStart"/>
       <w:r>
+        <w:t>Image_Process_Clear_sides</w:t>
+      </w:r>
+      <w:proofErr w:type="spellEnd"/>
+      <w:r>
+        <w:t xml:space="preserve">, </w:t>
+      </w:r>
+      <w:proofErr w:type="spellStart"/>
+      <w:r>
+        <w:t>Image_Process_Shift_even_columns</w:t>
+      </w:r>
+      <w:proofErr w:type="spellEnd"/>
+      <w:r>
+        <w:t xml:space="preserve">, </w:t>
+      </w:r>
+      <w:proofErr w:type="spellStart"/>
+      <w:r>
+        <w:t>Image_Process_Shift_odd_columns</w:t>
+      </w:r>
+      <w:proofErr w:type="spellEnd"/>
+      <w:r>
+        <w:t xml:space="preserve">, </w:t>
+      </w:r>
+      <w:proofErr w:type="spellStart"/>
+      <w:r>
+        <w:t>Image_Process_Shift_even_rows</w:t>
+      </w:r>
+      <w:proofErr w:type="spellEnd"/>
+      <w:r>
+        <w:t xml:space="preserve">, </w:t>
+      </w:r>
+      <w:proofErr w:type="spellStart"/>
+      <w:r>
+        <w:t>Image_Process_Shift_odd_rows</w:t>
+      </w:r>
+      <w:proofErr w:type="spellEnd"/>
+    </w:p>
+    <w:p>
+      <w:pPr>
+        <w:numPr>
+          <w:ilvl w:val="2"/>
+          <w:numId w:val="54"/>
+        </w:numPr>
+      </w:pPr>
+      <w:r>
+        <w:t>Some things are still missing, such as the X and Y scaling menus.</w:t>
+      </w:r>
+    </w:p>
+    <w:p>
+      <w:pPr>
+        <w:numPr>
+          <w:ilvl w:val="2"/>
+          <w:numId w:val="54"/>
+        </w:numPr>
+      </w:pPr>
+      <w:r>
+        <w:t>Using keyword “</w:t>
+      </w:r>
+      <w:proofErr w:type="spellStart"/>
+      <w:r>
+        <w:t>return_list</w:t>
+      </w:r>
+      <w:proofErr w:type="spellEnd"/>
+      <w:r>
+        <w:t>” in call will just return the processing commands list struct. Use to use this list elsewhere (e.g. in Wizard).</w:t>
+      </w:r>
+    </w:p>
+    <w:p>
+      <w:pPr>
+        <w:numPr>
+          <w:ilvl w:val="2"/>
+          <w:numId w:val="54"/>
+        </w:numPr>
+      </w:pPr>
+      <w:r>
+        <w:t>Rearranged to put list definition at the top.</w:t>
+      </w:r>
+    </w:p>
+    <w:p>
+      <w:pPr>
+        <w:numPr>
+          <w:ilvl w:val="1"/>
+          <w:numId w:val="54"/>
+        </w:numPr>
+      </w:pPr>
+      <w:proofErr w:type="spellStart"/>
+      <w:r>
+        <w:t>Image_Process_Shift_rows</w:t>
+      </w:r>
+      <w:proofErr w:type="spellEnd"/>
+      <w:r>
+        <w:t xml:space="preserve">, </w:t>
+      </w:r>
+      <w:proofErr w:type="spellStart"/>
+      <w:r>
+        <w:t>Image_Process_Shift</w:t>
+      </w:r>
+      <w:proofErr w:type="spellEnd"/>
+    </w:p>
+    <w:p>
+      <w:pPr>
+        <w:numPr>
+          <w:ilvl w:val="2"/>
+          <w:numId w:val="54"/>
+        </w:numPr>
+      </w:pPr>
+      <w:r>
+        <w:t>Add “[</w:t>
+      </w:r>
+      <w:proofErr w:type="spellStart"/>
+      <w:r>
+        <w:t>el</w:t>
+      </w:r>
+      <w:proofErr w:type="spellEnd"/>
+      <w:r>
+        <w:t>]” to History, as for any “*” operation on al planes.</w:t>
+      </w:r>
+    </w:p>
+    <w:p>
+      <w:pPr>
+        <w:numPr>
+          <w:ilvl w:val="1"/>
+          <w:numId w:val="54"/>
+        </w:numPr>
+      </w:pPr>
+      <w:proofErr w:type="spellStart"/>
+      <w:r>
+        <w:t>OnButton_Image_Process_Get</w:t>
+      </w:r>
+      <w:proofErr w:type="spellEnd"/>
+    </w:p>
+    <w:p>
+      <w:pPr>
+        <w:numPr>
+          <w:ilvl w:val="2"/>
+          <w:numId w:val="54"/>
+        </w:numPr>
+      </w:pPr>
+      <w:r>
+        <w:t xml:space="preserve">In </w:t>
+      </w:r>
+      <w:r>
+        <w:t xml:space="preserve">the </w:t>
+      </w:r>
+      <w:r>
+        <w:t xml:space="preserve">loop for the normal process operations, added “if not start then </w:t>
+      </w:r>
+      <w:proofErr w:type="spellStart"/>
+      <w:r>
+        <w:t>skip_el</w:t>
+      </w:r>
+      <w:proofErr w:type="spellEnd"/>
+      <w:r>
+        <w:t>=1” for “*” operations (applied to all element planes), so they get applied once (to all).</w:t>
+      </w:r>
+    </w:p>
+    <w:p>
+      <w:pPr>
+        <w:numPr>
+          <w:ilvl w:val="2"/>
+          <w:numId w:val="54"/>
+        </w:numPr>
+      </w:pPr>
+      <w:r>
         <w:lastRenderedPageBreak/>
-        <w:t>Image_Process_Clear_sides</w:t>
-      </w:r>
-      <w:proofErr w:type="spellEnd"/>
-      <w:r>
-        <w:t xml:space="preserve">, </w:t>
-      </w:r>
-      <w:proofErr w:type="spellStart"/>
-      <w:r>
-        <w:t>Image_Process_Shift_even_columns</w:t>
-      </w:r>
-      <w:proofErr w:type="spellEnd"/>
-      <w:r>
-        <w:t xml:space="preserve">, </w:t>
-      </w:r>
-      <w:proofErr w:type="spellStart"/>
-      <w:r>
-        <w:t>Image_Process_Shift_odd_columns</w:t>
-      </w:r>
-      <w:proofErr w:type="spellEnd"/>
-      <w:r>
-        <w:t xml:space="preserve">, </w:t>
-      </w:r>
-      <w:proofErr w:type="spellStart"/>
-      <w:r>
-        <w:t>Image_Process_Shift_even_rows</w:t>
-      </w:r>
-      <w:proofErr w:type="spellEnd"/>
-      <w:r>
-        <w:t xml:space="preserve">, </w:t>
-      </w:r>
-      <w:proofErr w:type="spellStart"/>
-      <w:r>
-        <w:t>Image_Process_Shift_odd_rows</w:t>
-      </w:r>
-      <w:proofErr w:type="spellEnd"/>
-    </w:p>
-    <w:p>
-      <w:pPr>
-        <w:numPr>
-          <w:ilvl w:val="2"/>
-          <w:numId w:val="54"/>
-        </w:numPr>
-      </w:pPr>
-      <w:r>
-        <w:t>Some things are still missing, such as the X and Y scaling menus.</w:t>
-      </w:r>
-    </w:p>
-    <w:p>
-      <w:pPr>
-        <w:numPr>
-          <w:ilvl w:val="2"/>
-          <w:numId w:val="54"/>
-        </w:numPr>
-      </w:pPr>
-      <w:r>
-        <w:t>Using keyword “</w:t>
-      </w:r>
-      <w:proofErr w:type="spellStart"/>
-      <w:r>
-        <w:t>return_list</w:t>
-      </w:r>
-      <w:proofErr w:type="spellEnd"/>
-      <w:r>
-        <w:t>” in call will just return the processing commands list struct. Use to use this list elsewhere (e.g. in Wizard).</w:t>
-      </w:r>
-    </w:p>
-    <w:p>
-      <w:pPr>
-        <w:numPr>
-          <w:ilvl w:val="2"/>
-          <w:numId w:val="54"/>
-        </w:numPr>
-      </w:pPr>
-      <w:r>
-        <w:t>Rearranged to put list definition at the top.</w:t>
-      </w:r>
-    </w:p>
-    <w:p>
-      <w:pPr>
-        <w:numPr>
-          <w:ilvl w:val="1"/>
-          <w:numId w:val="54"/>
-        </w:numPr>
-      </w:pPr>
-      <w:proofErr w:type="spellStart"/>
-      <w:r>
-        <w:t>Image_Process_Shift_rows</w:t>
-      </w:r>
-      <w:proofErr w:type="spellEnd"/>
-      <w:r>
-        <w:t xml:space="preserve">, </w:t>
-      </w:r>
-      <w:proofErr w:type="spellStart"/>
-      <w:r>
-        <w:t>Image_Process_Shift</w:t>
-      </w:r>
-      <w:proofErr w:type="spellEnd"/>
-    </w:p>
-    <w:p>
-      <w:pPr>
-        <w:numPr>
-          <w:ilvl w:val="2"/>
-          <w:numId w:val="54"/>
-        </w:numPr>
-      </w:pPr>
-      <w:r>
-        <w:t>Add “[</w:t>
-      </w:r>
-      <w:proofErr w:type="spellStart"/>
-      <w:r>
-        <w:t>el</w:t>
-      </w:r>
-      <w:proofErr w:type="spellEnd"/>
-      <w:r>
-        <w:t>]” to History, as for any “*” operation on al planes.</w:t>
-      </w:r>
-    </w:p>
-    <w:p>
-      <w:pPr>
-        <w:numPr>
-          <w:ilvl w:val="1"/>
-          <w:numId w:val="54"/>
-        </w:numPr>
-      </w:pPr>
-      <w:proofErr w:type="spellStart"/>
-      <w:r>
-        <w:t>OnButton_Image_Process_Get</w:t>
-      </w:r>
-      <w:proofErr w:type="spellEnd"/>
-    </w:p>
-    <w:p>
-      <w:pPr>
-        <w:numPr>
-          <w:ilvl w:val="2"/>
-          <w:numId w:val="54"/>
-        </w:numPr>
-      </w:pPr>
-      <w:r>
-        <w:t xml:space="preserve">In </w:t>
-      </w:r>
-      <w:r>
-        <w:t xml:space="preserve">the </w:t>
-      </w:r>
-      <w:r>
-        <w:t xml:space="preserve">loop for the normal process operations, added “if not start then </w:t>
-      </w:r>
-      <w:proofErr w:type="spellStart"/>
-      <w:r>
-        <w:t>skip_el</w:t>
-      </w:r>
-      <w:proofErr w:type="spellEnd"/>
-      <w:r>
-        <w:t>=1” for “*” operations (applied to all element planes), so they get applied once (to all).</w:t>
-      </w:r>
-    </w:p>
-    <w:p>
-      <w:pPr>
-        <w:numPr>
-          <w:ilvl w:val="2"/>
-          <w:numId w:val="54"/>
-        </w:numPr>
-      </w:pPr>
-      <w:r>
         <w:t>Use a case insensitive compare between operation retrieved from image file and the operations list in ‘</w:t>
       </w:r>
       <w:proofErr w:type="spellStart"/>
@@ -11792,7 +12481,6 @@
         </w:numPr>
       </w:pPr>
       <w:r>
-        <w:lastRenderedPageBreak/>
         <w:t>Tested, and works with Batch-Sort, as one of a set of “digital filte</w:t>
       </w:r>
       <w:r>
@@ -11914,6 +12602,7 @@
         </w:numPr>
       </w:pPr>
       <w:r>
+        <w:lastRenderedPageBreak/>
         <w:t>Use ‘</w:t>
       </w:r>
       <w:proofErr w:type="spellStart"/>
@@ -12518,7 +13207,6 @@
         </w:numPr>
       </w:pPr>
       <w:r>
-        <w:lastRenderedPageBreak/>
         <w:t>Version 8.8y</w:t>
       </w:r>
     </w:p>
@@ -12687,6 +13375,7 @@
         <w:rPr>
           <w:lang w:val="en-AU"/>
         </w:rPr>
+        <w:lastRenderedPageBreak/>
         <w:t>22 July, 2025</w:t>
       </w:r>
     </w:p>
@@ -13175,7 +13864,6 @@
         </w:numPr>
       </w:pPr>
       <w:r>
-        <w:lastRenderedPageBreak/>
         <w:t>Version 8.8x</w:t>
       </w:r>
     </w:p>
@@ -13321,6 +14009,7 @@
         </w:numPr>
       </w:pPr>
       <w:r>
+        <w:lastRenderedPageBreak/>
         <w:t>Add “c/s” as a special element as alternative to “Rate”.</w:t>
       </w:r>
     </w:p>
@@ -13966,7 +14655,6 @@
         </w:numPr>
       </w:pPr>
       <w:r>
-        <w:lastRenderedPageBreak/>
         <w:t>Version 8.8v</w:t>
       </w:r>
     </w:p>
@@ -14151,6 +14839,7 @@
         </w:numPr>
       </w:pPr>
       <w:r>
+        <w:lastRenderedPageBreak/>
         <w:t>Detect ‘</w:t>
       </w:r>
       <w:proofErr w:type="spellStart"/>
@@ -14656,7 +15345,6 @@
         </w:numPr>
       </w:pPr>
       <w:r>
-        <w:lastRenderedPageBreak/>
         <w:t xml:space="preserve">In the main </w:t>
       </w:r>
       <w:proofErr w:type="spellStart"/>
@@ -14783,6 +15471,7 @@
       </w:pPr>
       <w:proofErr w:type="spellStart"/>
       <w:r>
+        <w:lastRenderedPageBreak/>
         <w:t>Set_image_view</w:t>
       </w:r>
       <w:proofErr w:type="spellEnd"/>
@@ -15325,7 +16014,6 @@
         <w:rPr>
           <w:lang w:val="en-AU"/>
         </w:rPr>
-        <w:lastRenderedPageBreak/>
         <w:t>4 Mar, 2025</w:t>
       </w:r>
     </w:p>
@@ -15453,6 +16141,7 @@
         </w:numPr>
       </w:pPr>
       <w:r>
+        <w:lastRenderedPageBreak/>
         <w:t>Reads P06 tree of NXS files into spectra.</w:t>
       </w:r>
     </w:p>
@@ -15771,7 +16460,6 @@
         <w:rPr>
           <w:lang w:val="en-AU"/>
         </w:rPr>
-        <w:lastRenderedPageBreak/>
         <w:t>27 Jan, 2025</w:t>
       </w:r>
     </w:p>
@@ -15949,6 +16637,7 @@
         </w:numPr>
       </w:pPr>
       <w:r>
+        <w:lastRenderedPageBreak/>
         <w:t>Make detector Layout behave similarly, inheriting the path for the detector file.</w:t>
       </w:r>
     </w:p>
@@ -16410,7 +17099,6 @@
         </w:numPr>
       </w:pPr>
       <w:r>
-        <w:lastRenderedPageBreak/>
         <w:t>Can’t spawn “activate” in IDL v9, as it does not exist; skip.</w:t>
       </w:r>
     </w:p>
@@ -16577,6 +17265,7 @@
         </w:numPr>
       </w:pPr>
       <w:r>
+        <w:lastRenderedPageBreak/>
         <w:t>Firstly, I forgot I was in “develop” when upgrading the Workspace in IDL 9.1.</w:t>
       </w:r>
     </w:p>
@@ -17127,7 +17816,6 @@
         </w:numPr>
       </w:pPr>
       <w:r>
-        <w:lastRenderedPageBreak/>
         <w:t>Add a “tests” menu for the ‘compare’ routines.</w:t>
       </w:r>
     </w:p>
@@ -17247,6 +17935,7 @@
         </w:numPr>
       </w:pPr>
       <w:r>
+        <w:lastRenderedPageBreak/>
         <w:t>Fortunately, these parameters do not get used - they are for info only. However, the ’</w:t>
       </w:r>
       <w:proofErr w:type="spellStart"/>
@@ -17930,7 +18619,6 @@
         </w:numPr>
       </w:pPr>
       <w:r>
-        <w:lastRenderedPageBreak/>
         <w:t>Simply prints out any inconsistencies found to the ‘output’ file</w:t>
       </w:r>
       <w:r>
@@ -18101,6 +18789,7 @@
         </w:numPr>
       </w:pPr>
       <w:r>
+        <w:lastRenderedPageBreak/>
         <w:t xml:space="preserve">Remove </w:t>
       </w:r>
       <w:proofErr w:type="spellStart"/>
@@ -18655,7 +19344,6 @@
         </w:numPr>
       </w:pPr>
       <w:r>
-        <w:lastRenderedPageBreak/>
         <w:t>EVT</w:t>
       </w:r>
     </w:p>
@@ -18759,6 +19447,7 @@
         <w:rPr>
           <w:lang w:val="en-AU"/>
         </w:rPr>
+        <w:lastRenderedPageBreak/>
         <w:t>4 June, 2024</w:t>
       </w:r>
     </w:p>
@@ -19291,7 +19980,6 @@
         </w:numPr>
       </w:pPr>
       <w:r>
-        <w:lastRenderedPageBreak/>
         <w:t xml:space="preserve">Resolve routines: </w:t>
       </w:r>
       <w:proofErr w:type="spellStart"/>
@@ -19415,6 +20103,7 @@
         </w:numPr>
       </w:pPr>
       <w:r>
+        <w:lastRenderedPageBreak/>
         <w:t xml:space="preserve">We don’t want to set </w:t>
       </w:r>
       <w:proofErr w:type="spellStart"/>
@@ -20072,7 +20761,6 @@
         </w:numPr>
       </w:pPr>
       <w:r>
-        <w:lastRenderedPageBreak/>
         <w:t>Moved back into ‘main/</w:t>
       </w:r>
       <w:proofErr w:type="spellStart"/>
@@ -20233,6 +20921,7 @@
         </w:numPr>
       </w:pPr>
       <w:r>
+        <w:lastRenderedPageBreak/>
         <w:t xml:space="preserve">Set </w:t>
       </w:r>
       <w:r>
@@ -20966,7 +21655,6 @@
       </w:pPr>
       <w:proofErr w:type="spellStart"/>
       <w:r>
-        <w:lastRenderedPageBreak/>
         <w:t>fit_recalculate_yields</w:t>
       </w:r>
       <w:proofErr w:type="spellEnd"/>
@@ -21114,6 +21802,7 @@
       </w:pPr>
       <w:proofErr w:type="spellStart"/>
       <w:r>
+        <w:lastRenderedPageBreak/>
         <w:t>Maia_launch_initial</w:t>
       </w:r>
       <w:proofErr w:type="spellEnd"/>
@@ -21713,7 +22402,6 @@
         </w:numPr>
       </w:pPr>
       <w:r>
-        <w:lastRenderedPageBreak/>
         <w:t xml:space="preserve">Call </w:t>
       </w:r>
       <w:proofErr w:type="spellStart"/>
@@ -21812,6 +22500,7 @@
         </w:numPr>
       </w:pPr>
       <w:r>
+        <w:lastRenderedPageBreak/>
         <w:t>These include:</w:t>
       </w:r>
     </w:p>
@@ -22359,7 +23048,6 @@
         </w:numPr>
       </w:pPr>
       <w:r>
-        <w:lastRenderedPageBreak/>
         <w:t>Deleted some projects not needed for open source, such as junk tests, etc.</w:t>
       </w:r>
     </w:p>
@@ -22512,6 +23200,7 @@
         </w:numPr>
       </w:pPr>
       <w:r>
+        <w:lastRenderedPageBreak/>
         <w:t xml:space="preserve">Some get renamed: </w:t>
       </w:r>
       <w:proofErr w:type="spellStart"/>
@@ -25786,6 +26475,92 @@
     </w:lvl>
   </w:abstractNum>
   <w:abstractNum w:abstractNumId="26" w15:restartNumberingAfterBreak="0">
+    <w:nsid w:val="2EB504E3"/>
+    <w:multiLevelType w:val="hybridMultilevel"/>
+    <w:tmpl w:val="214CC6C4"/>
+    <w:lvl w:ilvl="0" w:tplc="FFFFFFFF">
+      <w:start w:val="1"/>
+      <w:numFmt w:val="decimal"/>
+      <w:lvlText w:val="%1."/>
+      <w:lvlJc w:val="left"/>
+      <w:pPr>
+        <w:ind w:left="720" w:hanging="360"/>
+      </w:pPr>
+    </w:lvl>
+    <w:lvl w:ilvl="1" w:tplc="FFFFFFFF">
+      <w:start w:val="1"/>
+      <w:numFmt w:val="lowerLetter"/>
+      <w:lvlText w:val="%2."/>
+      <w:lvlJc w:val="left"/>
+      <w:pPr>
+        <w:ind w:left="1440" w:hanging="360"/>
+      </w:pPr>
+    </w:lvl>
+    <w:lvl w:ilvl="2" w:tplc="FFFFFFFF">
+      <w:start w:val="1"/>
+      <w:numFmt w:val="lowerRoman"/>
+      <w:lvlText w:val="%3."/>
+      <w:lvlJc w:val="right"/>
+      <w:pPr>
+        <w:ind w:left="2160" w:hanging="180"/>
+      </w:pPr>
+    </w:lvl>
+    <w:lvl w:ilvl="3" w:tplc="FFFFFFFF">
+      <w:start w:val="1"/>
+      <w:numFmt w:val="decimal"/>
+      <w:lvlText w:val="%4."/>
+      <w:lvlJc w:val="left"/>
+      <w:pPr>
+        <w:ind w:left="2880" w:hanging="360"/>
+      </w:pPr>
+    </w:lvl>
+    <w:lvl w:ilvl="4" w:tplc="FFFFFFFF">
+      <w:start w:val="1"/>
+      <w:numFmt w:val="lowerLetter"/>
+      <w:lvlText w:val="%5."/>
+      <w:lvlJc w:val="left"/>
+      <w:pPr>
+        <w:ind w:left="3600" w:hanging="360"/>
+      </w:pPr>
+    </w:lvl>
+    <w:lvl w:ilvl="5" w:tplc="FFFFFFFF">
+      <w:start w:val="1"/>
+      <w:numFmt w:val="lowerRoman"/>
+      <w:lvlText w:val="%6."/>
+      <w:lvlJc w:val="right"/>
+      <w:pPr>
+        <w:ind w:left="4320" w:hanging="180"/>
+      </w:pPr>
+    </w:lvl>
+    <w:lvl w:ilvl="6" w:tplc="FFFFFFFF" w:tentative="1">
+      <w:start w:val="1"/>
+      <w:numFmt w:val="decimal"/>
+      <w:lvlText w:val="%7."/>
+      <w:lvlJc w:val="left"/>
+      <w:pPr>
+        <w:ind w:left="5040" w:hanging="360"/>
+      </w:pPr>
+    </w:lvl>
+    <w:lvl w:ilvl="7" w:tplc="FFFFFFFF" w:tentative="1">
+      <w:start w:val="1"/>
+      <w:numFmt w:val="lowerLetter"/>
+      <w:lvlText w:val="%8."/>
+      <w:lvlJc w:val="left"/>
+      <w:pPr>
+        <w:ind w:left="5760" w:hanging="360"/>
+      </w:pPr>
+    </w:lvl>
+    <w:lvl w:ilvl="8" w:tplc="FFFFFFFF" w:tentative="1">
+      <w:start w:val="1"/>
+      <w:numFmt w:val="lowerRoman"/>
+      <w:lvlText w:val="%9."/>
+      <w:lvlJc w:val="right"/>
+      <w:pPr>
+        <w:ind w:left="6480" w:hanging="180"/>
+      </w:pPr>
+    </w:lvl>
+  </w:abstractNum>
+  <w:abstractNum w:abstractNumId="27" w15:restartNumberingAfterBreak="0">
     <w:nsid w:val="2ED42603"/>
     <w:multiLevelType w:val="hybridMultilevel"/>
     <w:tmpl w:val="214CC6C4"/>
@@ -25871,7 +26646,7 @@
       </w:pPr>
     </w:lvl>
   </w:abstractNum>
-  <w:abstractNum w:abstractNumId="27" w15:restartNumberingAfterBreak="0">
+  <w:abstractNum w:abstractNumId="28" w15:restartNumberingAfterBreak="0">
     <w:nsid w:val="2F545F49"/>
     <w:multiLevelType w:val="hybridMultilevel"/>
     <w:tmpl w:val="214CC6C4"/>
@@ -25957,7 +26732,7 @@
       </w:pPr>
     </w:lvl>
   </w:abstractNum>
-  <w:abstractNum w:abstractNumId="28" w15:restartNumberingAfterBreak="0">
+  <w:abstractNum w:abstractNumId="29" w15:restartNumberingAfterBreak="0">
     <w:nsid w:val="2F731835"/>
     <w:multiLevelType w:val="hybridMultilevel"/>
     <w:tmpl w:val="214CC6C4"/>
@@ -26043,7 +26818,7 @@
       </w:pPr>
     </w:lvl>
   </w:abstractNum>
-  <w:abstractNum w:abstractNumId="29" w15:restartNumberingAfterBreak="0">
+  <w:abstractNum w:abstractNumId="30" w15:restartNumberingAfterBreak="0">
     <w:nsid w:val="32326CBE"/>
     <w:multiLevelType w:val="hybridMultilevel"/>
     <w:tmpl w:val="214CC6C4"/>
@@ -26129,7 +26904,7 @@
       </w:pPr>
     </w:lvl>
   </w:abstractNum>
-  <w:abstractNum w:abstractNumId="30" w15:restartNumberingAfterBreak="0">
+  <w:abstractNum w:abstractNumId="31" w15:restartNumberingAfterBreak="0">
     <w:nsid w:val="32A949EB"/>
     <w:multiLevelType w:val="hybridMultilevel"/>
     <w:tmpl w:val="214CC6C4"/>
@@ -26215,7 +26990,7 @@
       </w:pPr>
     </w:lvl>
   </w:abstractNum>
-  <w:abstractNum w:abstractNumId="31" w15:restartNumberingAfterBreak="0">
+  <w:abstractNum w:abstractNumId="32" w15:restartNumberingAfterBreak="0">
     <w:nsid w:val="33231170"/>
     <w:multiLevelType w:val="hybridMultilevel"/>
     <w:tmpl w:val="214CC6C4"/>
@@ -26301,7 +27076,7 @@
       </w:pPr>
     </w:lvl>
   </w:abstractNum>
-  <w:abstractNum w:abstractNumId="32" w15:restartNumberingAfterBreak="0">
+  <w:abstractNum w:abstractNumId="33" w15:restartNumberingAfterBreak="0">
     <w:nsid w:val="335B6E8D"/>
     <w:multiLevelType w:val="hybridMultilevel"/>
     <w:tmpl w:val="214CC6C4"/>
@@ -26387,7 +27162,7 @@
       </w:pPr>
     </w:lvl>
   </w:abstractNum>
-  <w:abstractNum w:abstractNumId="33" w15:restartNumberingAfterBreak="0">
+  <w:abstractNum w:abstractNumId="34" w15:restartNumberingAfterBreak="0">
     <w:nsid w:val="355B2568"/>
     <w:multiLevelType w:val="hybridMultilevel"/>
     <w:tmpl w:val="214CC6C4"/>
@@ -26473,7 +27248,7 @@
       </w:pPr>
     </w:lvl>
   </w:abstractNum>
-  <w:abstractNum w:abstractNumId="34" w15:restartNumberingAfterBreak="0">
+  <w:abstractNum w:abstractNumId="35" w15:restartNumberingAfterBreak="0">
     <w:nsid w:val="356645B8"/>
     <w:multiLevelType w:val="hybridMultilevel"/>
     <w:tmpl w:val="214CC6C4"/>
@@ -26559,7 +27334,7 @@
       </w:pPr>
     </w:lvl>
   </w:abstractNum>
-  <w:abstractNum w:abstractNumId="35" w15:restartNumberingAfterBreak="0">
+  <w:abstractNum w:abstractNumId="36" w15:restartNumberingAfterBreak="0">
     <w:nsid w:val="35B806D1"/>
     <w:multiLevelType w:val="hybridMultilevel"/>
     <w:tmpl w:val="214CC6C4"/>
@@ -26645,7 +27420,7 @@
       </w:pPr>
     </w:lvl>
   </w:abstractNum>
-  <w:abstractNum w:abstractNumId="36" w15:restartNumberingAfterBreak="0">
+  <w:abstractNum w:abstractNumId="37" w15:restartNumberingAfterBreak="0">
     <w:nsid w:val="364E1BD1"/>
     <w:multiLevelType w:val="hybridMultilevel"/>
     <w:tmpl w:val="214CC6C4"/>
@@ -26731,7 +27506,7 @@
       </w:pPr>
     </w:lvl>
   </w:abstractNum>
-  <w:abstractNum w:abstractNumId="37" w15:restartNumberingAfterBreak="0">
+  <w:abstractNum w:abstractNumId="38" w15:restartNumberingAfterBreak="0">
     <w:nsid w:val="37C0055A"/>
     <w:multiLevelType w:val="hybridMultilevel"/>
     <w:tmpl w:val="214CC6C4"/>
@@ -26817,7 +27592,7 @@
       </w:pPr>
     </w:lvl>
   </w:abstractNum>
-  <w:abstractNum w:abstractNumId="38" w15:restartNumberingAfterBreak="0">
+  <w:abstractNum w:abstractNumId="39" w15:restartNumberingAfterBreak="0">
     <w:nsid w:val="383C1F2F"/>
     <w:multiLevelType w:val="hybridMultilevel"/>
     <w:tmpl w:val="214CC6C4"/>
@@ -26903,7 +27678,7 @@
       </w:pPr>
     </w:lvl>
   </w:abstractNum>
-  <w:abstractNum w:abstractNumId="39" w15:restartNumberingAfterBreak="0">
+  <w:abstractNum w:abstractNumId="40" w15:restartNumberingAfterBreak="0">
     <w:nsid w:val="38677977"/>
     <w:multiLevelType w:val="hybridMultilevel"/>
     <w:tmpl w:val="214CC6C4"/>
@@ -26989,7 +27764,7 @@
       </w:pPr>
     </w:lvl>
   </w:abstractNum>
-  <w:abstractNum w:abstractNumId="40" w15:restartNumberingAfterBreak="0">
+  <w:abstractNum w:abstractNumId="41" w15:restartNumberingAfterBreak="0">
     <w:nsid w:val="39E017C7"/>
     <w:multiLevelType w:val="hybridMultilevel"/>
     <w:tmpl w:val="214CC6C4"/>
@@ -27075,7 +27850,7 @@
       </w:pPr>
     </w:lvl>
   </w:abstractNum>
-  <w:abstractNum w:abstractNumId="41" w15:restartNumberingAfterBreak="0">
+  <w:abstractNum w:abstractNumId="42" w15:restartNumberingAfterBreak="0">
     <w:nsid w:val="3A906D54"/>
     <w:multiLevelType w:val="hybridMultilevel"/>
     <w:tmpl w:val="214CC6C4"/>
@@ -27161,7 +27936,7 @@
       </w:pPr>
     </w:lvl>
   </w:abstractNum>
-  <w:abstractNum w:abstractNumId="42" w15:restartNumberingAfterBreak="0">
+  <w:abstractNum w:abstractNumId="43" w15:restartNumberingAfterBreak="0">
     <w:nsid w:val="3D360724"/>
     <w:multiLevelType w:val="hybridMultilevel"/>
     <w:tmpl w:val="214CC6C4"/>
@@ -27247,7 +28022,7 @@
       </w:pPr>
     </w:lvl>
   </w:abstractNum>
-  <w:abstractNum w:abstractNumId="43" w15:restartNumberingAfterBreak="0">
+  <w:abstractNum w:abstractNumId="44" w15:restartNumberingAfterBreak="0">
     <w:nsid w:val="3DF10524"/>
     <w:multiLevelType w:val="hybridMultilevel"/>
     <w:tmpl w:val="214CC6C4"/>
@@ -27333,7 +28108,7 @@
       </w:pPr>
     </w:lvl>
   </w:abstractNum>
-  <w:abstractNum w:abstractNumId="44" w15:restartNumberingAfterBreak="0">
+  <w:abstractNum w:abstractNumId="45" w15:restartNumberingAfterBreak="0">
     <w:nsid w:val="3F097101"/>
     <w:multiLevelType w:val="hybridMultilevel"/>
     <w:tmpl w:val="214CC6C4"/>
@@ -27419,7 +28194,7 @@
       </w:pPr>
     </w:lvl>
   </w:abstractNum>
-  <w:abstractNum w:abstractNumId="45" w15:restartNumberingAfterBreak="0">
+  <w:abstractNum w:abstractNumId="46" w15:restartNumberingAfterBreak="0">
     <w:nsid w:val="41A638B2"/>
     <w:multiLevelType w:val="hybridMultilevel"/>
     <w:tmpl w:val="214CC6C4"/>
@@ -27505,7 +28280,7 @@
       </w:pPr>
     </w:lvl>
   </w:abstractNum>
-  <w:abstractNum w:abstractNumId="46" w15:restartNumberingAfterBreak="0">
+  <w:abstractNum w:abstractNumId="47" w15:restartNumberingAfterBreak="0">
     <w:nsid w:val="420D41AB"/>
     <w:multiLevelType w:val="hybridMultilevel"/>
     <w:tmpl w:val="214CC6C4"/>
@@ -27591,7 +28366,7 @@
       </w:pPr>
     </w:lvl>
   </w:abstractNum>
-  <w:abstractNum w:abstractNumId="47" w15:restartNumberingAfterBreak="0">
+  <w:abstractNum w:abstractNumId="48" w15:restartNumberingAfterBreak="0">
     <w:nsid w:val="436129C1"/>
     <w:multiLevelType w:val="hybridMultilevel"/>
     <w:tmpl w:val="214CC6C4"/>
@@ -27677,7 +28452,7 @@
       </w:pPr>
     </w:lvl>
   </w:abstractNum>
-  <w:abstractNum w:abstractNumId="48" w15:restartNumberingAfterBreak="0">
+  <w:abstractNum w:abstractNumId="49" w15:restartNumberingAfterBreak="0">
     <w:nsid w:val="438D310E"/>
     <w:multiLevelType w:val="hybridMultilevel"/>
     <w:tmpl w:val="3DFEBE78"/>
@@ -27763,7 +28538,7 @@
       </w:pPr>
     </w:lvl>
   </w:abstractNum>
-  <w:abstractNum w:abstractNumId="49" w15:restartNumberingAfterBreak="0">
+  <w:abstractNum w:abstractNumId="50" w15:restartNumberingAfterBreak="0">
     <w:nsid w:val="45F80AA2"/>
     <w:multiLevelType w:val="hybridMultilevel"/>
     <w:tmpl w:val="214CC6C4"/>
@@ -27849,7 +28624,7 @@
       </w:pPr>
     </w:lvl>
   </w:abstractNum>
-  <w:abstractNum w:abstractNumId="50" w15:restartNumberingAfterBreak="0">
+  <w:abstractNum w:abstractNumId="51" w15:restartNumberingAfterBreak="0">
     <w:nsid w:val="46D104B0"/>
     <w:multiLevelType w:val="hybridMultilevel"/>
     <w:tmpl w:val="214CC6C4"/>
@@ -27935,7 +28710,7 @@
       </w:pPr>
     </w:lvl>
   </w:abstractNum>
-  <w:abstractNum w:abstractNumId="51" w15:restartNumberingAfterBreak="0">
+  <w:abstractNum w:abstractNumId="52" w15:restartNumberingAfterBreak="0">
     <w:nsid w:val="47C63F90"/>
     <w:multiLevelType w:val="hybridMultilevel"/>
     <w:tmpl w:val="214CC6C4"/>
@@ -28021,7 +28796,7 @@
       </w:pPr>
     </w:lvl>
   </w:abstractNum>
-  <w:abstractNum w:abstractNumId="52" w15:restartNumberingAfterBreak="0">
+  <w:abstractNum w:abstractNumId="53" w15:restartNumberingAfterBreak="0">
     <w:nsid w:val="48424B8D"/>
     <w:multiLevelType w:val="hybridMultilevel"/>
     <w:tmpl w:val="214CC6C4"/>
@@ -28107,7 +28882,7 @@
       </w:pPr>
     </w:lvl>
   </w:abstractNum>
-  <w:abstractNum w:abstractNumId="53" w15:restartNumberingAfterBreak="0">
+  <w:abstractNum w:abstractNumId="54" w15:restartNumberingAfterBreak="0">
     <w:nsid w:val="48E719F4"/>
     <w:multiLevelType w:val="hybridMultilevel"/>
     <w:tmpl w:val="214CC6C4"/>
@@ -28193,7 +28968,7 @@
       </w:pPr>
     </w:lvl>
   </w:abstractNum>
-  <w:abstractNum w:abstractNumId="54" w15:restartNumberingAfterBreak="0">
+  <w:abstractNum w:abstractNumId="55" w15:restartNumberingAfterBreak="0">
     <w:nsid w:val="4A276C6F"/>
     <w:multiLevelType w:val="hybridMultilevel"/>
     <w:tmpl w:val="214CC6C4"/>
@@ -28279,7 +29054,7 @@
       </w:pPr>
     </w:lvl>
   </w:abstractNum>
-  <w:abstractNum w:abstractNumId="55" w15:restartNumberingAfterBreak="0">
+  <w:abstractNum w:abstractNumId="56" w15:restartNumberingAfterBreak="0">
     <w:nsid w:val="4ACD66FA"/>
     <w:multiLevelType w:val="hybridMultilevel"/>
     <w:tmpl w:val="214CC6C4"/>
@@ -28365,7 +29140,7 @@
       </w:pPr>
     </w:lvl>
   </w:abstractNum>
-  <w:abstractNum w:abstractNumId="56" w15:restartNumberingAfterBreak="0">
+  <w:abstractNum w:abstractNumId="57" w15:restartNumberingAfterBreak="0">
     <w:nsid w:val="4B205F99"/>
     <w:multiLevelType w:val="hybridMultilevel"/>
     <w:tmpl w:val="214CC6C4"/>
@@ -28451,7 +29226,7 @@
       </w:pPr>
     </w:lvl>
   </w:abstractNum>
-  <w:abstractNum w:abstractNumId="57" w15:restartNumberingAfterBreak="0">
+  <w:abstractNum w:abstractNumId="58" w15:restartNumberingAfterBreak="0">
     <w:nsid w:val="4B7F04E2"/>
     <w:multiLevelType w:val="hybridMultilevel"/>
     <w:tmpl w:val="214CC6C4"/>
@@ -28537,7 +29312,7 @@
       </w:pPr>
     </w:lvl>
   </w:abstractNum>
-  <w:abstractNum w:abstractNumId="58" w15:restartNumberingAfterBreak="0">
+  <w:abstractNum w:abstractNumId="59" w15:restartNumberingAfterBreak="0">
     <w:nsid w:val="4D9A4F4C"/>
     <w:multiLevelType w:val="hybridMultilevel"/>
     <w:tmpl w:val="214CC6C4"/>
@@ -28623,7 +29398,7 @@
       </w:pPr>
     </w:lvl>
   </w:abstractNum>
-  <w:abstractNum w:abstractNumId="59" w15:restartNumberingAfterBreak="0">
+  <w:abstractNum w:abstractNumId="60" w15:restartNumberingAfterBreak="0">
     <w:nsid w:val="4FB81408"/>
     <w:multiLevelType w:val="hybridMultilevel"/>
     <w:tmpl w:val="214CC6C4"/>
@@ -28709,7 +29484,7 @@
       </w:pPr>
     </w:lvl>
   </w:abstractNum>
-  <w:abstractNum w:abstractNumId="60" w15:restartNumberingAfterBreak="0">
+  <w:abstractNum w:abstractNumId="61" w15:restartNumberingAfterBreak="0">
     <w:nsid w:val="56833A85"/>
     <w:multiLevelType w:val="hybridMultilevel"/>
     <w:tmpl w:val="214CC6C4"/>
@@ -28795,7 +29570,7 @@
       </w:pPr>
     </w:lvl>
   </w:abstractNum>
-  <w:abstractNum w:abstractNumId="61" w15:restartNumberingAfterBreak="0">
+  <w:abstractNum w:abstractNumId="62" w15:restartNumberingAfterBreak="0">
     <w:nsid w:val="56C643E7"/>
     <w:multiLevelType w:val="hybridMultilevel"/>
     <w:tmpl w:val="214CC6C4"/>
@@ -28881,7 +29656,7 @@
       </w:pPr>
     </w:lvl>
   </w:abstractNum>
-  <w:abstractNum w:abstractNumId="62" w15:restartNumberingAfterBreak="0">
+  <w:abstractNum w:abstractNumId="63" w15:restartNumberingAfterBreak="0">
     <w:nsid w:val="59654531"/>
     <w:multiLevelType w:val="hybridMultilevel"/>
     <w:tmpl w:val="214CC6C4"/>
@@ -28967,7 +29742,7 @@
       </w:pPr>
     </w:lvl>
   </w:abstractNum>
-  <w:abstractNum w:abstractNumId="63" w15:restartNumberingAfterBreak="0">
+  <w:abstractNum w:abstractNumId="64" w15:restartNumberingAfterBreak="0">
     <w:nsid w:val="59CA6D97"/>
     <w:multiLevelType w:val="hybridMultilevel"/>
     <w:tmpl w:val="214CC6C4"/>
@@ -29053,7 +29828,7 @@
       </w:pPr>
     </w:lvl>
   </w:abstractNum>
-  <w:abstractNum w:abstractNumId="64" w15:restartNumberingAfterBreak="0">
+  <w:abstractNum w:abstractNumId="65" w15:restartNumberingAfterBreak="0">
     <w:nsid w:val="60085356"/>
     <w:multiLevelType w:val="hybridMultilevel"/>
     <w:tmpl w:val="214CC6C4"/>
@@ -29139,7 +29914,7 @@
       </w:pPr>
     </w:lvl>
   </w:abstractNum>
-  <w:abstractNum w:abstractNumId="65" w15:restartNumberingAfterBreak="0">
+  <w:abstractNum w:abstractNumId="66" w15:restartNumberingAfterBreak="0">
     <w:nsid w:val="61513B38"/>
     <w:multiLevelType w:val="hybridMultilevel"/>
     <w:tmpl w:val="4D926568"/>
@@ -29225,7 +30000,7 @@
       </w:pPr>
     </w:lvl>
   </w:abstractNum>
-  <w:abstractNum w:abstractNumId="66" w15:restartNumberingAfterBreak="0">
+  <w:abstractNum w:abstractNumId="67" w15:restartNumberingAfterBreak="0">
     <w:nsid w:val="62686DE9"/>
     <w:multiLevelType w:val="hybridMultilevel"/>
     <w:tmpl w:val="214CC6C4"/>
@@ -29311,7 +30086,7 @@
       </w:pPr>
     </w:lvl>
   </w:abstractNum>
-  <w:abstractNum w:abstractNumId="67" w15:restartNumberingAfterBreak="0">
+  <w:abstractNum w:abstractNumId="68" w15:restartNumberingAfterBreak="0">
     <w:nsid w:val="64B53F9E"/>
     <w:multiLevelType w:val="hybridMultilevel"/>
     <w:tmpl w:val="214CC6C4"/>
@@ -29397,7 +30172,7 @@
       </w:pPr>
     </w:lvl>
   </w:abstractNum>
-  <w:abstractNum w:abstractNumId="68" w15:restartNumberingAfterBreak="0">
+  <w:abstractNum w:abstractNumId="69" w15:restartNumberingAfterBreak="0">
     <w:nsid w:val="64EC6FC0"/>
     <w:multiLevelType w:val="hybridMultilevel"/>
     <w:tmpl w:val="214CC6C4"/>
@@ -29483,7 +30258,7 @@
       </w:pPr>
     </w:lvl>
   </w:abstractNum>
-  <w:abstractNum w:abstractNumId="69" w15:restartNumberingAfterBreak="0">
+  <w:abstractNum w:abstractNumId="70" w15:restartNumberingAfterBreak="0">
     <w:nsid w:val="65466AFA"/>
     <w:multiLevelType w:val="hybridMultilevel"/>
     <w:tmpl w:val="214CC6C4"/>
@@ -29569,7 +30344,7 @@
       </w:pPr>
     </w:lvl>
   </w:abstractNum>
-  <w:abstractNum w:abstractNumId="70" w15:restartNumberingAfterBreak="0">
+  <w:abstractNum w:abstractNumId="71" w15:restartNumberingAfterBreak="0">
     <w:nsid w:val="65972C68"/>
     <w:multiLevelType w:val="hybridMultilevel"/>
     <w:tmpl w:val="214CC6C4"/>
@@ -29655,7 +30430,7 @@
       </w:pPr>
     </w:lvl>
   </w:abstractNum>
-  <w:abstractNum w:abstractNumId="71" w15:restartNumberingAfterBreak="0">
+  <w:abstractNum w:abstractNumId="72" w15:restartNumberingAfterBreak="0">
     <w:nsid w:val="68167485"/>
     <w:multiLevelType w:val="hybridMultilevel"/>
     <w:tmpl w:val="214CC6C4"/>
@@ -29741,7 +30516,7 @@
       </w:pPr>
     </w:lvl>
   </w:abstractNum>
-  <w:abstractNum w:abstractNumId="72" w15:restartNumberingAfterBreak="0">
+  <w:abstractNum w:abstractNumId="73" w15:restartNumberingAfterBreak="0">
     <w:nsid w:val="692A3DFA"/>
     <w:multiLevelType w:val="hybridMultilevel"/>
     <w:tmpl w:val="214CC6C4"/>
@@ -29827,7 +30602,7 @@
       </w:pPr>
     </w:lvl>
   </w:abstractNum>
-  <w:abstractNum w:abstractNumId="73" w15:restartNumberingAfterBreak="0">
+  <w:abstractNum w:abstractNumId="74" w15:restartNumberingAfterBreak="0">
     <w:nsid w:val="6AD95314"/>
     <w:multiLevelType w:val="hybridMultilevel"/>
     <w:tmpl w:val="214CC6C4"/>
@@ -29913,7 +30688,7 @@
       </w:pPr>
     </w:lvl>
   </w:abstractNum>
-  <w:abstractNum w:abstractNumId="74" w15:restartNumberingAfterBreak="0">
+  <w:abstractNum w:abstractNumId="75" w15:restartNumberingAfterBreak="0">
     <w:nsid w:val="6B085590"/>
     <w:multiLevelType w:val="hybridMultilevel"/>
     <w:tmpl w:val="214CC6C4"/>
@@ -29999,7 +30774,7 @@
       </w:pPr>
     </w:lvl>
   </w:abstractNum>
-  <w:abstractNum w:abstractNumId="75" w15:restartNumberingAfterBreak="0">
+  <w:abstractNum w:abstractNumId="76" w15:restartNumberingAfterBreak="0">
     <w:nsid w:val="6C802E67"/>
     <w:multiLevelType w:val="hybridMultilevel"/>
     <w:tmpl w:val="214CC6C4"/>
@@ -30085,7 +30860,7 @@
       </w:pPr>
     </w:lvl>
   </w:abstractNum>
-  <w:abstractNum w:abstractNumId="76" w15:restartNumberingAfterBreak="0">
+  <w:abstractNum w:abstractNumId="77" w15:restartNumberingAfterBreak="0">
     <w:nsid w:val="6EC96476"/>
     <w:multiLevelType w:val="hybridMultilevel"/>
     <w:tmpl w:val="3DFEBE78"/>
@@ -30171,7 +30946,7 @@
       </w:pPr>
     </w:lvl>
   </w:abstractNum>
-  <w:abstractNum w:abstractNumId="77" w15:restartNumberingAfterBreak="0">
+  <w:abstractNum w:abstractNumId="78" w15:restartNumberingAfterBreak="0">
     <w:nsid w:val="726B52C1"/>
     <w:multiLevelType w:val="hybridMultilevel"/>
     <w:tmpl w:val="214CC6C4"/>
@@ -30257,7 +31032,7 @@
       </w:pPr>
     </w:lvl>
   </w:abstractNum>
-  <w:abstractNum w:abstractNumId="78" w15:restartNumberingAfterBreak="0">
+  <w:abstractNum w:abstractNumId="79" w15:restartNumberingAfterBreak="0">
     <w:nsid w:val="728B0421"/>
     <w:multiLevelType w:val="hybridMultilevel"/>
     <w:tmpl w:val="214CC6C4"/>
@@ -30343,7 +31118,7 @@
       </w:pPr>
     </w:lvl>
   </w:abstractNum>
-  <w:abstractNum w:abstractNumId="79" w15:restartNumberingAfterBreak="0">
+  <w:abstractNum w:abstractNumId="80" w15:restartNumberingAfterBreak="0">
     <w:nsid w:val="73401E16"/>
     <w:multiLevelType w:val="hybridMultilevel"/>
     <w:tmpl w:val="214CC6C4"/>
@@ -30429,7 +31204,7 @@
       </w:pPr>
     </w:lvl>
   </w:abstractNum>
-  <w:abstractNum w:abstractNumId="80" w15:restartNumberingAfterBreak="0">
+  <w:abstractNum w:abstractNumId="81" w15:restartNumberingAfterBreak="0">
     <w:nsid w:val="75336A05"/>
     <w:multiLevelType w:val="hybridMultilevel"/>
     <w:tmpl w:val="214CC6C4"/>
@@ -30515,7 +31290,7 @@
       </w:pPr>
     </w:lvl>
   </w:abstractNum>
-  <w:abstractNum w:abstractNumId="81" w15:restartNumberingAfterBreak="0">
+  <w:abstractNum w:abstractNumId="82" w15:restartNumberingAfterBreak="0">
     <w:nsid w:val="779B3DB6"/>
     <w:multiLevelType w:val="hybridMultilevel"/>
     <w:tmpl w:val="214CC6C4"/>
@@ -30601,7 +31376,7 @@
       </w:pPr>
     </w:lvl>
   </w:abstractNum>
-  <w:abstractNum w:abstractNumId="82" w15:restartNumberingAfterBreak="0">
+  <w:abstractNum w:abstractNumId="83" w15:restartNumberingAfterBreak="0">
     <w:nsid w:val="7B23524C"/>
     <w:multiLevelType w:val="hybridMultilevel"/>
     <w:tmpl w:val="214CC6C4"/>
@@ -30687,7 +31462,7 @@
       </w:pPr>
     </w:lvl>
   </w:abstractNum>
-  <w:abstractNum w:abstractNumId="83" w15:restartNumberingAfterBreak="0">
+  <w:abstractNum w:abstractNumId="84" w15:restartNumberingAfterBreak="0">
     <w:nsid w:val="7B8572AA"/>
     <w:multiLevelType w:val="hybridMultilevel"/>
     <w:tmpl w:val="214CC6C4"/>
@@ -30773,7 +31548,7 @@
       </w:pPr>
     </w:lvl>
   </w:abstractNum>
-  <w:abstractNum w:abstractNumId="84" w15:restartNumberingAfterBreak="0">
+  <w:abstractNum w:abstractNumId="85" w15:restartNumberingAfterBreak="0">
     <w:nsid w:val="7BD85F1F"/>
     <w:multiLevelType w:val="hybridMultilevel"/>
     <w:tmpl w:val="214CC6C4"/>
@@ -30859,7 +31634,7 @@
       </w:pPr>
     </w:lvl>
   </w:abstractNum>
-  <w:abstractNum w:abstractNumId="85" w15:restartNumberingAfterBreak="0">
+  <w:abstractNum w:abstractNumId="86" w15:restartNumberingAfterBreak="0">
     <w:nsid w:val="7BE25365"/>
     <w:multiLevelType w:val="hybridMultilevel"/>
     <w:tmpl w:val="214CC6C4"/>
@@ -30946,22 +31721,22 @@
     </w:lvl>
   </w:abstractNum>
   <w:num w:numId="1" w16cid:durableId="689641893">
-    <w:abstractNumId w:val="43"/>
+    <w:abstractNumId w:val="44"/>
   </w:num>
   <w:num w:numId="2" w16cid:durableId="1714230517">
-    <w:abstractNumId w:val="60"/>
+    <w:abstractNumId w:val="61"/>
   </w:num>
   <w:num w:numId="3" w16cid:durableId="602418336">
-    <w:abstractNumId w:val="35"/>
+    <w:abstractNumId w:val="36"/>
   </w:num>
   <w:num w:numId="4" w16cid:durableId="319892333">
-    <w:abstractNumId w:val="65"/>
+    <w:abstractNumId w:val="66"/>
   </w:num>
   <w:num w:numId="5" w16cid:durableId="1682078939">
-    <w:abstractNumId w:val="71"/>
+    <w:abstractNumId w:val="72"/>
   </w:num>
   <w:num w:numId="6" w16cid:durableId="69352654">
-    <w:abstractNumId w:val="85"/>
+    <w:abstractNumId w:val="86"/>
   </w:num>
   <w:num w:numId="7" w16cid:durableId="399905843">
     <w:abstractNumId w:val="7"/>
@@ -30976,46 +31751,46 @@
     <w:abstractNumId w:val="5"/>
   </w:num>
   <w:num w:numId="11" w16cid:durableId="618218708">
-    <w:abstractNumId w:val="54"/>
+    <w:abstractNumId w:val="55"/>
   </w:num>
   <w:num w:numId="12" w16cid:durableId="1832019268">
-    <w:abstractNumId w:val="40"/>
+    <w:abstractNumId w:val="41"/>
   </w:num>
   <w:num w:numId="13" w16cid:durableId="2082213922">
-    <w:abstractNumId w:val="41"/>
+    <w:abstractNumId w:val="42"/>
   </w:num>
   <w:num w:numId="14" w16cid:durableId="1738477231">
-    <w:abstractNumId w:val="32"/>
+    <w:abstractNumId w:val="33"/>
   </w:num>
   <w:num w:numId="15" w16cid:durableId="1288660286">
-    <w:abstractNumId w:val="45"/>
+    <w:abstractNumId w:val="46"/>
   </w:num>
   <w:num w:numId="16" w16cid:durableId="1466973576">
-    <w:abstractNumId w:val="55"/>
+    <w:abstractNumId w:val="56"/>
   </w:num>
   <w:num w:numId="17" w16cid:durableId="1965962244">
-    <w:abstractNumId w:val="57"/>
+    <w:abstractNumId w:val="58"/>
   </w:num>
   <w:num w:numId="18" w16cid:durableId="857428966">
+    <w:abstractNumId w:val="60"/>
+  </w:num>
+  <w:num w:numId="19" w16cid:durableId="1102727235">
+    <w:abstractNumId w:val="84"/>
+  </w:num>
+  <w:num w:numId="20" w16cid:durableId="1825009635">
     <w:abstractNumId w:val="59"/>
   </w:num>
-  <w:num w:numId="19" w16cid:durableId="1102727235">
-    <w:abstractNumId w:val="83"/>
-  </w:num>
-  <w:num w:numId="20" w16cid:durableId="1825009635">
-    <w:abstractNumId w:val="58"/>
-  </w:num>
   <w:num w:numId="21" w16cid:durableId="1057817951">
-    <w:abstractNumId w:val="61"/>
+    <w:abstractNumId w:val="62"/>
   </w:num>
   <w:num w:numId="22" w16cid:durableId="1840851271">
-    <w:abstractNumId w:val="77"/>
+    <w:abstractNumId w:val="78"/>
   </w:num>
   <w:num w:numId="23" w16cid:durableId="31004759">
     <w:abstractNumId w:val="4"/>
   </w:num>
   <w:num w:numId="24" w16cid:durableId="196084434">
-    <w:abstractNumId w:val="47"/>
+    <w:abstractNumId w:val="48"/>
   </w:num>
   <w:num w:numId="25" w16cid:durableId="1765566772">
     <w:abstractNumId w:val="23"/>
@@ -31027,13 +31802,13 @@
     <w:abstractNumId w:val="12"/>
   </w:num>
   <w:num w:numId="28" w16cid:durableId="1531380620">
+    <w:abstractNumId w:val="80"/>
+  </w:num>
+  <w:num w:numId="29" w16cid:durableId="557712069">
     <w:abstractNumId w:val="79"/>
   </w:num>
-  <w:num w:numId="29" w16cid:durableId="557712069">
-    <w:abstractNumId w:val="78"/>
-  </w:num>
   <w:num w:numId="30" w16cid:durableId="1426002138">
-    <w:abstractNumId w:val="64"/>
+    <w:abstractNumId w:val="65"/>
   </w:num>
   <w:num w:numId="31" w16cid:durableId="1782995960">
     <w:abstractNumId w:val="9"/>
@@ -31042,7 +31817,7 @@
     <w:abstractNumId w:val="0"/>
   </w:num>
   <w:num w:numId="33" w16cid:durableId="1618559931">
-    <w:abstractNumId w:val="70"/>
+    <w:abstractNumId w:val="71"/>
   </w:num>
   <w:num w:numId="34" w16cid:durableId="1400901532">
     <w:abstractNumId w:val="16"/>
@@ -31054,37 +31829,37 @@
     <w:abstractNumId w:val="8"/>
   </w:num>
   <w:num w:numId="37" w16cid:durableId="2038775239">
-    <w:abstractNumId w:val="26"/>
+    <w:abstractNumId w:val="27"/>
   </w:num>
   <w:num w:numId="38" w16cid:durableId="649556783">
-    <w:abstractNumId w:val="81"/>
+    <w:abstractNumId w:val="82"/>
   </w:num>
   <w:num w:numId="39" w16cid:durableId="1653750230">
-    <w:abstractNumId w:val="73"/>
+    <w:abstractNumId w:val="74"/>
   </w:num>
   <w:num w:numId="40" w16cid:durableId="938491575">
-    <w:abstractNumId w:val="62"/>
+    <w:abstractNumId w:val="63"/>
   </w:num>
   <w:num w:numId="41" w16cid:durableId="282228440">
-    <w:abstractNumId w:val="63"/>
+    <w:abstractNumId w:val="64"/>
   </w:num>
   <w:num w:numId="42" w16cid:durableId="1852640132">
-    <w:abstractNumId w:val="75"/>
+    <w:abstractNumId w:val="76"/>
   </w:num>
   <w:num w:numId="43" w16cid:durableId="1346899273">
     <w:abstractNumId w:val="13"/>
   </w:num>
   <w:num w:numId="44" w16cid:durableId="209463670">
-    <w:abstractNumId w:val="38"/>
+    <w:abstractNumId w:val="39"/>
   </w:num>
   <w:num w:numId="45" w16cid:durableId="1180044402">
-    <w:abstractNumId w:val="74"/>
+    <w:abstractNumId w:val="75"/>
   </w:num>
   <w:num w:numId="46" w16cid:durableId="581186852">
-    <w:abstractNumId w:val="52"/>
+    <w:abstractNumId w:val="53"/>
   </w:num>
   <w:num w:numId="47" w16cid:durableId="114033196">
-    <w:abstractNumId w:val="80"/>
+    <w:abstractNumId w:val="81"/>
   </w:num>
   <w:num w:numId="48" w16cid:durableId="1500274313">
     <w:abstractNumId w:val="24"/>
@@ -31096,22 +31871,22 @@
     <w:abstractNumId w:val="2"/>
   </w:num>
   <w:num w:numId="51" w16cid:durableId="71323068">
-    <w:abstractNumId w:val="46"/>
+    <w:abstractNumId w:val="47"/>
   </w:num>
   <w:num w:numId="52" w16cid:durableId="791824026">
     <w:abstractNumId w:val="11"/>
   </w:num>
   <w:num w:numId="53" w16cid:durableId="1858884855">
-    <w:abstractNumId w:val="28"/>
+    <w:abstractNumId w:val="29"/>
   </w:num>
   <w:num w:numId="54" w16cid:durableId="743839652">
     <w:abstractNumId w:val="14"/>
   </w:num>
   <w:num w:numId="55" w16cid:durableId="319189279">
-    <w:abstractNumId w:val="44"/>
+    <w:abstractNumId w:val="45"/>
   </w:num>
   <w:num w:numId="56" w16cid:durableId="1084959942">
-    <w:abstractNumId w:val="56"/>
+    <w:abstractNumId w:val="57"/>
   </w:num>
   <w:num w:numId="57" w16cid:durableId="551775919">
     <w:abstractNumId w:val="15"/>
@@ -31120,88 +31895,91 @@
     <w:abstractNumId w:val="25"/>
   </w:num>
   <w:num w:numId="59" w16cid:durableId="147091717">
-    <w:abstractNumId w:val="37"/>
+    <w:abstractNumId w:val="38"/>
   </w:num>
   <w:num w:numId="60" w16cid:durableId="83651720">
-    <w:abstractNumId w:val="29"/>
+    <w:abstractNumId w:val="30"/>
   </w:num>
   <w:num w:numId="61" w16cid:durableId="669069174">
+    <w:abstractNumId w:val="32"/>
+  </w:num>
+  <w:num w:numId="62" w16cid:durableId="1481843890">
+    <w:abstractNumId w:val="70"/>
+  </w:num>
+  <w:num w:numId="63" w16cid:durableId="410079372">
+    <w:abstractNumId w:val="40"/>
+  </w:num>
+  <w:num w:numId="64" w16cid:durableId="811677477">
+    <w:abstractNumId w:val="28"/>
+  </w:num>
+  <w:num w:numId="65" w16cid:durableId="817649347">
+    <w:abstractNumId w:val="43"/>
+  </w:num>
+  <w:num w:numId="66" w16cid:durableId="2128037891">
+    <w:abstractNumId w:val="51"/>
+  </w:num>
+  <w:num w:numId="67" w16cid:durableId="1726219145">
+    <w:abstractNumId w:val="83"/>
+  </w:num>
+  <w:num w:numId="68" w16cid:durableId="1766615434">
+    <w:abstractNumId w:val="69"/>
+  </w:num>
+  <w:num w:numId="69" w16cid:durableId="280234627">
     <w:abstractNumId w:val="31"/>
   </w:num>
-  <w:num w:numId="62" w16cid:durableId="1481843890">
-    <w:abstractNumId w:val="69"/>
-  </w:num>
-  <w:num w:numId="63" w16cid:durableId="410079372">
-    <w:abstractNumId w:val="39"/>
-  </w:num>
-  <w:num w:numId="64" w16cid:durableId="811677477">
-    <w:abstractNumId w:val="27"/>
-  </w:num>
-  <w:num w:numId="65" w16cid:durableId="817649347">
-    <w:abstractNumId w:val="42"/>
-  </w:num>
-  <w:num w:numId="66" w16cid:durableId="2128037891">
-    <w:abstractNumId w:val="50"/>
-  </w:num>
-  <w:num w:numId="67" w16cid:durableId="1726219145">
-    <w:abstractNumId w:val="82"/>
-  </w:num>
-  <w:num w:numId="68" w16cid:durableId="1766615434">
-    <w:abstractNumId w:val="68"/>
-  </w:num>
-  <w:num w:numId="69" w16cid:durableId="280234627">
-    <w:abstractNumId w:val="30"/>
-  </w:num>
   <w:num w:numId="70" w16cid:durableId="1207910607">
-    <w:abstractNumId w:val="66"/>
+    <w:abstractNumId w:val="67"/>
   </w:num>
   <w:num w:numId="71" w16cid:durableId="1640526067">
     <w:abstractNumId w:val="3"/>
   </w:num>
   <w:num w:numId="72" w16cid:durableId="1480685150">
-    <w:abstractNumId w:val="53"/>
+    <w:abstractNumId w:val="54"/>
   </w:num>
   <w:num w:numId="73" w16cid:durableId="1902905193">
-    <w:abstractNumId w:val="34"/>
+    <w:abstractNumId w:val="35"/>
   </w:num>
   <w:num w:numId="74" w16cid:durableId="1699814716">
-    <w:abstractNumId w:val="72"/>
+    <w:abstractNumId w:val="73"/>
   </w:num>
   <w:num w:numId="75" w16cid:durableId="1095246353">
     <w:abstractNumId w:val="20"/>
   </w:num>
   <w:num w:numId="76" w16cid:durableId="1478064906">
-    <w:abstractNumId w:val="67"/>
+    <w:abstractNumId w:val="68"/>
   </w:num>
   <w:num w:numId="77" w16cid:durableId="153382077">
     <w:abstractNumId w:val="6"/>
   </w:num>
   <w:num w:numId="78" w16cid:durableId="1038506737">
-    <w:abstractNumId w:val="33"/>
+    <w:abstractNumId w:val="34"/>
   </w:num>
   <w:num w:numId="79" w16cid:durableId="370769239">
+    <w:abstractNumId w:val="50"/>
+  </w:num>
+  <w:num w:numId="80" w16cid:durableId="1923443751">
+    <w:abstractNumId w:val="85"/>
+  </w:num>
+  <w:num w:numId="81" w16cid:durableId="1046220979">
     <w:abstractNumId w:val="49"/>
   </w:num>
-  <w:num w:numId="80" w16cid:durableId="1923443751">
-    <w:abstractNumId w:val="84"/>
-  </w:num>
-  <w:num w:numId="81" w16cid:durableId="1046220979">
-    <w:abstractNumId w:val="48"/>
-  </w:num>
   <w:num w:numId="82" w16cid:durableId="1474832525">
-    <w:abstractNumId w:val="76"/>
+    <w:abstractNumId w:val="77"/>
   </w:num>
   <w:num w:numId="83" w16cid:durableId="1246305922">
     <w:abstractNumId w:val="19"/>
   </w:num>
   <w:num w:numId="84" w16cid:durableId="769273119">
-    <w:abstractNumId w:val="51"/>
+    <w:abstractNumId w:val="52"/>
   </w:num>
   <w:num w:numId="85" w16cid:durableId="1243024461">
-    <w:abstractNumId w:val="36"/>
+    <w:abstractNumId w:val="37"/>
   </w:num>
   <w:num w:numId="86" w16cid:durableId="1116098005">
     <w:abstractNumId w:val="22"/>
+  </w:num>
+  <w:num w:numId="87" w16cid:durableId="640186409">
+    <w:abstractNumId w:val="26"/>
   </w:num>
   <w:numIdMacAtCleanup w:val="82"/>
 </w:numbering>
@@ -31703,7 +32481,6 @@
   <w:style w:type="character" w:default="1" w:styleId="DefaultParagraphFont">
     <w:name w:val="Default Paragraph Font"/>
     <w:uiPriority w:val="1"/>
-    <w:semiHidden/>
     <w:unhideWhenUsed/>
   </w:style>
   <w:style w:type="table" w:default="1" w:styleId="TableNormal">

</xml_diff>